<commit_message>
Implementación de generación de PATs de Maestría (03-06) para carrera PINE. Incluye nueva sección en index.html y lógica de procesamiento en memoria.
</commit_message>
<xml_diff>
--- a/resources/Convocatoria_Docentes.docx
+++ b/resources/Convocatoria_Docentes.docx
@@ -1,6 +1,6 @@
 
 <file path=word/document.xml><?xml version="1.0" encoding="utf-8"?>
-<w:document xmlns:wpc="http://schemas.microsoft.com/office/word/2010/wordprocessingCanvas" xmlns:cx="http://schemas.microsoft.com/office/drawing/2014/chartex" xmlns:cx1="http://schemas.microsoft.com/office/drawing/2015/9/8/chartex" xmlns:cx2="http://schemas.microsoft.com/office/drawing/2015/10/21/chartex" xmlns:cx3="http://schemas.microsoft.com/office/drawing/2016/5/9/chartex" xmlns:cx4="http://schemas.microsoft.com/office/drawing/2016/5/10/chartex" xmlns:cx5="http://schemas.microsoft.com/office/drawing/2016/5/11/chartex" xmlns:cx6="http://schemas.microsoft.com/office/drawing/2016/5/12/chartex" xmlns:cx7="http://schemas.microsoft.com/office/drawing/2016/5/13/chartex" xmlns:cx8="http://schemas.microsoft.com/office/drawing/2016/5/14/chartex" xmlns:mc="http://schemas.openxmlformats.org/markup-compatibility/2006" xmlns:aink="http://schemas.microsoft.com/office/drawing/2016/ink" xmlns:am3d="http://schemas.microsoft.com/office/drawing/2017/model3d" xmlns:o="urn:schemas-microsoft-com:office:office" xmlns:oel="http://schemas.microsoft.com/office/2019/extlst" xmlns:r="http://schemas.openxmlformats.org/officeDocument/2006/relationships" xmlns:m="http://schemas.openxmlformats.org/officeDocument/2006/math" xmlns:v="urn:schemas-microsoft-com:vml" xmlns:wp14="http://schemas.microsoft.com/office/word/2010/wordprocessingDrawing" xmlns:wp="http://schemas.openxmlformats.org/drawingml/2006/wordprocessingDrawing" xmlns:w10="urn:schemas-microsoft-com:office:word" xmlns:w="http://schemas.openxmlformats.org/wordprocessingml/2006/main" xmlns:w14="http://schemas.microsoft.com/office/word/2010/wordml" xmlns:w15="http://schemas.microsoft.com/office/word/2012/wordml" xmlns:w16cex="http://schemas.microsoft.com/office/word/2018/wordml/cex" xmlns:w16cid="http://schemas.microsoft.com/office/word/2016/wordml/cid" xmlns:w16="http://schemas.microsoft.com/office/word/2018/wordml" xmlns:w16du="http://schemas.microsoft.com/office/word/2023/wordml/word16du" xmlns:w16sdtdh="http://schemas.microsoft.com/office/word/2020/wordml/sdtdatahash" xmlns:w16se="http://schemas.microsoft.com/office/word/2015/wordml/symex" xmlns:wpg="http://schemas.microsoft.com/office/word/2010/wordprocessingGroup" xmlns:wpi="http://schemas.microsoft.com/office/word/2010/wordprocessingInk" xmlns:wne="http://schemas.microsoft.com/office/word/2006/wordml" xmlns:wps="http://schemas.microsoft.com/office/word/2010/wordprocessingShape" mc:Ignorable="w14 w15 w16se w16cid w16 w16cex w16sdtdh wp14">
+<w:document xmlns:wpc="http://schemas.microsoft.com/office/word/2010/wordprocessingCanvas" xmlns:cx="http://schemas.microsoft.com/office/drawing/2014/chartex" xmlns:cx1="http://schemas.microsoft.com/office/drawing/2015/9/8/chartex" xmlns:cx2="http://schemas.microsoft.com/office/drawing/2015/10/21/chartex" xmlns:cx3="http://schemas.microsoft.com/office/drawing/2016/5/9/chartex" xmlns:cx4="http://schemas.microsoft.com/office/drawing/2016/5/10/chartex" xmlns:cx5="http://schemas.microsoft.com/office/drawing/2016/5/11/chartex" xmlns:cx6="http://schemas.microsoft.com/office/drawing/2016/5/12/chartex" xmlns:cx7="http://schemas.microsoft.com/office/drawing/2016/5/13/chartex" xmlns:cx8="http://schemas.microsoft.com/office/drawing/2016/5/14/chartex" xmlns:mc="http://schemas.openxmlformats.org/markup-compatibility/2006" xmlns:aink="http://schemas.microsoft.com/office/drawing/2016/ink" xmlns:am3d="http://schemas.microsoft.com/office/drawing/2017/model3d" xmlns:o="urn:schemas-microsoft-com:office:office" xmlns:oel="http://schemas.microsoft.com/office/2019/extlst" xmlns:r="http://schemas.openxmlformats.org/officeDocument/2006/relationships" xmlns:m="http://schemas.openxmlformats.org/officeDocument/2006/math" xmlns:v="urn:schemas-microsoft-com:vml" xmlns:wp14="http://schemas.microsoft.com/office/word/2010/wordprocessingDrawing" xmlns:wp="http://schemas.openxmlformats.org/drawingml/2006/wordprocessingDrawing" xmlns:w10="urn:schemas-microsoft-com:office:word" xmlns:w="http://schemas.openxmlformats.org/wordprocessingml/2006/main" xmlns:w14="http://schemas.microsoft.com/office/word/2010/wordml" xmlns:w15="http://schemas.microsoft.com/office/word/2012/wordml" xmlns:w16cex="http://schemas.microsoft.com/office/word/2018/wordml/cex" xmlns:w16cid="http://schemas.microsoft.com/office/word/2016/wordml/cid" xmlns:w16="http://schemas.microsoft.com/office/word/2018/wordml" xmlns:w16du="http://schemas.microsoft.com/office/word/2023/wordml/word16du" xmlns:w16sdtdh="http://schemas.microsoft.com/office/word/2020/wordml/sdtdatahash" xmlns:w16sdtfl="http://schemas.microsoft.com/office/word/2024/wordml/sdtformatlock" xmlns:w16se="http://schemas.microsoft.com/office/word/2015/wordml/symex" xmlns:wpg="http://schemas.microsoft.com/office/word/2010/wordprocessingGroup" xmlns:wpi="http://schemas.microsoft.com/office/word/2010/wordprocessingInk" xmlns:wne="http://schemas.microsoft.com/office/word/2006/wordml" xmlns:wps="http://schemas.microsoft.com/office/word/2010/wordprocessingShape" mc:Ignorable="w14 w15 w16se w16cid w16 w16cex w16sdtdh w16sdtfl w16du wp14">
   <w:body>
     <w:p>
       <w:pPr>
@@ -310,27 +310,7 @@
           <w:szCs w:val="20"/>
           <w:lang w:val="es-EC" w:eastAsia="es-EC"/>
         </w:rPr>
-        <w:t xml:space="preserve">Lic. Jorge Corral </w:t>
-      </w:r>
-      <w:proofErr w:type="spellStart"/>
-      <w:r>
-        <w:rPr>
-          <w:rFonts w:ascii="Verdana" w:hAnsi="Verdana" w:cstheme="minorHAnsi"/>
-          <w:sz w:val="20"/>
-          <w:szCs w:val="20"/>
-          <w:lang w:val="es-EC" w:eastAsia="es-EC"/>
-        </w:rPr>
-        <w:t>Joniaux</w:t>
-      </w:r>
-      <w:proofErr w:type="spellEnd"/>
-      <w:r>
-        <w:rPr>
-          <w:rFonts w:ascii="Verdana" w:hAnsi="Verdana" w:cstheme="minorHAnsi"/>
-          <w:sz w:val="20"/>
-          <w:szCs w:val="20"/>
-          <w:lang w:val="es-EC" w:eastAsia="es-EC"/>
-        </w:rPr>
-        <w:t>, Mg.</w:t>
+        <w:t>Lic. Jorge Corral Joniaux, Mg.</w:t>
       </w:r>
     </w:p>
     <w:p>
@@ -362,15 +342,15 @@
           <w:rFonts w:ascii="Verdana" w:hAnsi="Verdana" w:cstheme="minorHAnsi"/>
           <w:sz w:val="20"/>
           <w:szCs w:val="20"/>
-          <w:lang w:val="pt-BR" w:eastAsia="es-EC"/>
-        </w:rPr>
-      </w:pPr>
-      <w:r>
-        <w:rPr>
-          <w:rFonts w:ascii="Verdana" w:hAnsi="Verdana" w:cstheme="minorHAnsi"/>
-          <w:sz w:val="20"/>
-          <w:szCs w:val="20"/>
-          <w:lang w:val="pt-BR" w:eastAsia="es-EC"/>
+          <w:lang w:val="es-EC" w:eastAsia="es-EC"/>
+        </w:rPr>
+      </w:pPr>
+      <w:r>
+        <w:rPr>
+          <w:rFonts w:ascii="Verdana" w:hAnsi="Verdana" w:cstheme="minorHAnsi"/>
+          <w:sz w:val="20"/>
+          <w:szCs w:val="20"/>
+          <w:lang w:val="es-EC" w:eastAsia="es-EC"/>
         </w:rPr>
         <w:t>Lic. Laura Mena Sánchez, Mg.</w:t>
       </w:r>
@@ -435,47 +415,7 @@
           <w:szCs w:val="20"/>
           <w:lang w:val="es-EC" w:eastAsia="es-EC"/>
         </w:rPr>
-        <w:t xml:space="preserve">Lic. </w:t>
-      </w:r>
-      <w:proofErr w:type="spellStart"/>
-      <w:r>
-        <w:rPr>
-          <w:rFonts w:ascii="Verdana" w:hAnsi="Verdana" w:cstheme="minorHAnsi"/>
-          <w:sz w:val="20"/>
-          <w:szCs w:val="20"/>
-          <w:lang w:val="es-EC" w:eastAsia="es-EC"/>
-        </w:rPr>
-        <w:t>Cintya</w:t>
-      </w:r>
-      <w:proofErr w:type="spellEnd"/>
-      <w:r>
-        <w:rPr>
-          <w:rFonts w:ascii="Verdana" w:hAnsi="Verdana" w:cstheme="minorHAnsi"/>
-          <w:sz w:val="20"/>
-          <w:szCs w:val="20"/>
-          <w:lang w:val="es-EC" w:eastAsia="es-EC"/>
-        </w:rPr>
-        <w:t xml:space="preserve"> Zambrano </w:t>
-      </w:r>
-      <w:proofErr w:type="spellStart"/>
-      <w:r>
-        <w:rPr>
-          <w:rFonts w:ascii="Verdana" w:hAnsi="Verdana" w:cstheme="minorHAnsi"/>
-          <w:sz w:val="20"/>
-          <w:szCs w:val="20"/>
-          <w:lang w:val="es-EC" w:eastAsia="es-EC"/>
-        </w:rPr>
-        <w:t>Zambrano</w:t>
-      </w:r>
-      <w:proofErr w:type="spellEnd"/>
-      <w:r>
-        <w:rPr>
-          <w:rFonts w:ascii="Verdana" w:hAnsi="Verdana" w:cstheme="minorHAnsi"/>
-          <w:sz w:val="20"/>
-          <w:szCs w:val="20"/>
-          <w:lang w:val="es-EC" w:eastAsia="es-EC"/>
-        </w:rPr>
-        <w:t>, Mg</w:t>
+        <w:t>Lic. Cintya Zambrano Zambrano, Mg</w:t>
       </w:r>
     </w:p>
     <w:p>
@@ -1071,7 +1011,7 @@
     </w:p>
     <w:tbl>
       <w:tblPr>
-        <w:tblStyle w:val="Tablaconcuadrcula"/>
+        <w:tblStyle w:val="TableGrid"/>
         <w:tblW w:w="8926" w:type="dxa"/>
         <w:tblLook w:val="04A0" w:firstRow="1" w:lastRow="0" w:firstColumn="1" w:lastColumn="0" w:noHBand="0" w:noVBand="1"/>
       </w:tblPr>
@@ -1967,15 +1907,6 @@
           <w:sz w:val="20"/>
           <w:szCs w:val="20"/>
         </w:rPr>
-        <w:t xml:space="preserve">CONVOCATORIA N. </w:t>
-      </w:r>
-      <w:r>
-        <w:rPr>
-          <w:rFonts w:ascii="Verdana" w:hAnsi="Verdana" w:cstheme="minorHAnsi"/>
-          <w:b/>
-          <w:sz w:val="20"/>
-          <w:szCs w:val="20"/>
-        </w:rPr>
         <w:t xml:space="preserve">{{NUM_CONVOCATORIA}}, {{PERIODO}} </w:t>
       </w:r>
       <w:r>
@@ -2180,7 +2111,7 @@
     </w:p>
     <w:tbl>
       <w:tblPr>
-        <w:tblStyle w:val="Tablaconcuadrcula"/>
+        <w:tblStyle w:val="TableGrid"/>
         <w:tblW w:w="5424" w:type="pct"/>
         <w:tblInd w:w="-289" w:type="dxa"/>
         <w:tblLook w:val="04A0" w:firstRow="1" w:lastRow="0" w:firstColumn="1" w:lastColumn="0" w:noHBand="0" w:noVBand="1"/>
@@ -2220,7 +2151,6 @@
                 <w:szCs w:val="20"/>
               </w:rPr>
             </w:pPr>
-            <w:proofErr w:type="spellStart"/>
             <w:r>
               <w:rPr>
                 <w:rFonts w:ascii="Verdana" w:hAnsi="Verdana"/>
@@ -2231,7 +2161,6 @@
               </w:rPr>
               <w:t>N°</w:t>
             </w:r>
-            <w:proofErr w:type="spellEnd"/>
           </w:p>
         </w:tc>
         <w:tc>
@@ -3616,7 +3545,7 @@
 </file>
 
 <file path=word/endnotes.xml><?xml version="1.0" encoding="utf-8"?>
-<w:endnotes xmlns:wpc="http://schemas.microsoft.com/office/word/2010/wordprocessingCanvas" xmlns:cx="http://schemas.microsoft.com/office/drawing/2014/chartex" xmlns:cx1="http://schemas.microsoft.com/office/drawing/2015/9/8/chartex" xmlns:cx2="http://schemas.microsoft.com/office/drawing/2015/10/21/chartex" xmlns:cx3="http://schemas.microsoft.com/office/drawing/2016/5/9/chartex" xmlns:cx4="http://schemas.microsoft.com/office/drawing/2016/5/10/chartex" xmlns:cx5="http://schemas.microsoft.com/office/drawing/2016/5/11/chartex" xmlns:cx6="http://schemas.microsoft.com/office/drawing/2016/5/12/chartex" xmlns:cx7="http://schemas.microsoft.com/office/drawing/2016/5/13/chartex" xmlns:cx8="http://schemas.microsoft.com/office/drawing/2016/5/14/chartex" xmlns:mc="http://schemas.openxmlformats.org/markup-compatibility/2006" xmlns:aink="http://schemas.microsoft.com/office/drawing/2016/ink" xmlns:am3d="http://schemas.microsoft.com/office/drawing/2017/model3d" xmlns:o="urn:schemas-microsoft-com:office:office" xmlns:oel="http://schemas.microsoft.com/office/2019/extlst" xmlns:r="http://schemas.openxmlformats.org/officeDocument/2006/relationships" xmlns:m="http://schemas.openxmlformats.org/officeDocument/2006/math" xmlns:v="urn:schemas-microsoft-com:vml" xmlns:wp14="http://schemas.microsoft.com/office/word/2010/wordprocessingDrawing" xmlns:wp="http://schemas.openxmlformats.org/drawingml/2006/wordprocessingDrawing" xmlns:w10="urn:schemas-microsoft-com:office:word" xmlns:w="http://schemas.openxmlformats.org/wordprocessingml/2006/main" xmlns:w14="http://schemas.microsoft.com/office/word/2010/wordml" xmlns:w15="http://schemas.microsoft.com/office/word/2012/wordml" xmlns:w16cex="http://schemas.microsoft.com/office/word/2018/wordml/cex" xmlns:w16cid="http://schemas.microsoft.com/office/word/2016/wordml/cid" xmlns:w16="http://schemas.microsoft.com/office/word/2018/wordml" xmlns:w16du="http://schemas.microsoft.com/office/word/2023/wordml/word16du" xmlns:w16sdtdh="http://schemas.microsoft.com/office/word/2020/wordml/sdtdatahash" xmlns:w16se="http://schemas.microsoft.com/office/word/2015/wordml/symex" xmlns:wpg="http://schemas.microsoft.com/office/word/2010/wordprocessingGroup" xmlns:wpi="http://schemas.microsoft.com/office/word/2010/wordprocessingInk" xmlns:wne="http://schemas.microsoft.com/office/word/2006/wordml" xmlns:wps="http://schemas.microsoft.com/office/word/2010/wordprocessingShape" mc:Ignorable="w14 w15 w16se w16cid w16 w16cex w16sdtdh wp14">
+<w:endnotes xmlns:wpc="http://schemas.microsoft.com/office/word/2010/wordprocessingCanvas" xmlns:cx="http://schemas.microsoft.com/office/drawing/2014/chartex" xmlns:cx1="http://schemas.microsoft.com/office/drawing/2015/9/8/chartex" xmlns:cx2="http://schemas.microsoft.com/office/drawing/2015/10/21/chartex" xmlns:cx3="http://schemas.microsoft.com/office/drawing/2016/5/9/chartex" xmlns:cx4="http://schemas.microsoft.com/office/drawing/2016/5/10/chartex" xmlns:cx5="http://schemas.microsoft.com/office/drawing/2016/5/11/chartex" xmlns:cx6="http://schemas.microsoft.com/office/drawing/2016/5/12/chartex" xmlns:cx7="http://schemas.microsoft.com/office/drawing/2016/5/13/chartex" xmlns:cx8="http://schemas.microsoft.com/office/drawing/2016/5/14/chartex" xmlns:mc="http://schemas.openxmlformats.org/markup-compatibility/2006" xmlns:aink="http://schemas.microsoft.com/office/drawing/2016/ink" xmlns:am3d="http://schemas.microsoft.com/office/drawing/2017/model3d" xmlns:o="urn:schemas-microsoft-com:office:office" xmlns:oel="http://schemas.microsoft.com/office/2019/extlst" xmlns:r="http://schemas.openxmlformats.org/officeDocument/2006/relationships" xmlns:m="http://schemas.openxmlformats.org/officeDocument/2006/math" xmlns:v="urn:schemas-microsoft-com:vml" xmlns:wp14="http://schemas.microsoft.com/office/word/2010/wordprocessingDrawing" xmlns:wp="http://schemas.openxmlformats.org/drawingml/2006/wordprocessingDrawing" xmlns:w10="urn:schemas-microsoft-com:office:word" xmlns:w="http://schemas.openxmlformats.org/wordprocessingml/2006/main" xmlns:w14="http://schemas.microsoft.com/office/word/2010/wordml" xmlns:w15="http://schemas.microsoft.com/office/word/2012/wordml" xmlns:w16cex="http://schemas.microsoft.com/office/word/2018/wordml/cex" xmlns:w16cid="http://schemas.microsoft.com/office/word/2016/wordml/cid" xmlns:w16="http://schemas.microsoft.com/office/word/2018/wordml" xmlns:w16du="http://schemas.microsoft.com/office/word/2023/wordml/word16du" xmlns:w16sdtdh="http://schemas.microsoft.com/office/word/2020/wordml/sdtdatahash" xmlns:w16sdtfl="http://schemas.microsoft.com/office/word/2024/wordml/sdtformatlock" xmlns:w16se="http://schemas.microsoft.com/office/word/2015/wordml/symex" xmlns:wpg="http://schemas.microsoft.com/office/word/2010/wordprocessingGroup" xmlns:wpi="http://schemas.microsoft.com/office/word/2010/wordprocessingInk" xmlns:wne="http://schemas.microsoft.com/office/word/2006/wordml" xmlns:wps="http://schemas.microsoft.com/office/word/2010/wordprocessingShape" mc:Ignorable="w14 w15 w16se w16cid w16 w16cex w16sdtdh w16sdtfl w16du wp14">
   <w:endnote w:type="separator" w:id="-1">
     <w:p>
       <w:r>
@@ -3635,7 +3564,7 @@
 </file>
 
 <file path=word/footnotes.xml><?xml version="1.0" encoding="utf-8"?>
-<w:footnotes xmlns:wpc="http://schemas.microsoft.com/office/word/2010/wordprocessingCanvas" xmlns:cx="http://schemas.microsoft.com/office/drawing/2014/chartex" xmlns:cx1="http://schemas.microsoft.com/office/drawing/2015/9/8/chartex" xmlns:cx2="http://schemas.microsoft.com/office/drawing/2015/10/21/chartex" xmlns:cx3="http://schemas.microsoft.com/office/drawing/2016/5/9/chartex" xmlns:cx4="http://schemas.microsoft.com/office/drawing/2016/5/10/chartex" xmlns:cx5="http://schemas.microsoft.com/office/drawing/2016/5/11/chartex" xmlns:cx6="http://schemas.microsoft.com/office/drawing/2016/5/12/chartex" xmlns:cx7="http://schemas.microsoft.com/office/drawing/2016/5/13/chartex" xmlns:cx8="http://schemas.microsoft.com/office/drawing/2016/5/14/chartex" xmlns:mc="http://schemas.openxmlformats.org/markup-compatibility/2006" xmlns:aink="http://schemas.microsoft.com/office/drawing/2016/ink" xmlns:am3d="http://schemas.microsoft.com/office/drawing/2017/model3d" xmlns:o="urn:schemas-microsoft-com:office:office" xmlns:oel="http://schemas.microsoft.com/office/2019/extlst" xmlns:r="http://schemas.openxmlformats.org/officeDocument/2006/relationships" xmlns:m="http://schemas.openxmlformats.org/officeDocument/2006/math" xmlns:v="urn:schemas-microsoft-com:vml" xmlns:wp14="http://schemas.microsoft.com/office/word/2010/wordprocessingDrawing" xmlns:wp="http://schemas.openxmlformats.org/drawingml/2006/wordprocessingDrawing" xmlns:w10="urn:schemas-microsoft-com:office:word" xmlns:w="http://schemas.openxmlformats.org/wordprocessingml/2006/main" xmlns:w14="http://schemas.microsoft.com/office/word/2010/wordml" xmlns:w15="http://schemas.microsoft.com/office/word/2012/wordml" xmlns:w16cex="http://schemas.microsoft.com/office/word/2018/wordml/cex" xmlns:w16cid="http://schemas.microsoft.com/office/word/2016/wordml/cid" xmlns:w16="http://schemas.microsoft.com/office/word/2018/wordml" xmlns:w16du="http://schemas.microsoft.com/office/word/2023/wordml/word16du" xmlns:w16sdtdh="http://schemas.microsoft.com/office/word/2020/wordml/sdtdatahash" xmlns:w16se="http://schemas.microsoft.com/office/word/2015/wordml/symex" xmlns:wpg="http://schemas.microsoft.com/office/word/2010/wordprocessingGroup" xmlns:wpi="http://schemas.microsoft.com/office/word/2010/wordprocessingInk" xmlns:wne="http://schemas.microsoft.com/office/word/2006/wordml" xmlns:wps="http://schemas.microsoft.com/office/word/2010/wordprocessingShape" mc:Ignorable="w14 w15 w16se w16cid w16 w16cex w16sdtdh wp14">
+<w:footnotes xmlns:wpc="http://schemas.microsoft.com/office/word/2010/wordprocessingCanvas" xmlns:cx="http://schemas.microsoft.com/office/drawing/2014/chartex" xmlns:cx1="http://schemas.microsoft.com/office/drawing/2015/9/8/chartex" xmlns:cx2="http://schemas.microsoft.com/office/drawing/2015/10/21/chartex" xmlns:cx3="http://schemas.microsoft.com/office/drawing/2016/5/9/chartex" xmlns:cx4="http://schemas.microsoft.com/office/drawing/2016/5/10/chartex" xmlns:cx5="http://schemas.microsoft.com/office/drawing/2016/5/11/chartex" xmlns:cx6="http://schemas.microsoft.com/office/drawing/2016/5/12/chartex" xmlns:cx7="http://schemas.microsoft.com/office/drawing/2016/5/13/chartex" xmlns:cx8="http://schemas.microsoft.com/office/drawing/2016/5/14/chartex" xmlns:mc="http://schemas.openxmlformats.org/markup-compatibility/2006" xmlns:aink="http://schemas.microsoft.com/office/drawing/2016/ink" xmlns:am3d="http://schemas.microsoft.com/office/drawing/2017/model3d" xmlns:o="urn:schemas-microsoft-com:office:office" xmlns:oel="http://schemas.microsoft.com/office/2019/extlst" xmlns:r="http://schemas.openxmlformats.org/officeDocument/2006/relationships" xmlns:m="http://schemas.openxmlformats.org/officeDocument/2006/math" xmlns:v="urn:schemas-microsoft-com:vml" xmlns:wp14="http://schemas.microsoft.com/office/word/2010/wordprocessingDrawing" xmlns:wp="http://schemas.openxmlformats.org/drawingml/2006/wordprocessingDrawing" xmlns:w10="urn:schemas-microsoft-com:office:word" xmlns:w="http://schemas.openxmlformats.org/wordprocessingml/2006/main" xmlns:w14="http://schemas.microsoft.com/office/word/2010/wordml" xmlns:w15="http://schemas.microsoft.com/office/word/2012/wordml" xmlns:w16cex="http://schemas.microsoft.com/office/word/2018/wordml/cex" xmlns:w16cid="http://schemas.microsoft.com/office/word/2016/wordml/cid" xmlns:w16="http://schemas.microsoft.com/office/word/2018/wordml" xmlns:w16du="http://schemas.microsoft.com/office/word/2023/wordml/word16du" xmlns:w16sdtdh="http://schemas.microsoft.com/office/word/2020/wordml/sdtdatahash" xmlns:w16sdtfl="http://schemas.microsoft.com/office/word/2024/wordml/sdtformatlock" xmlns:w16se="http://schemas.microsoft.com/office/word/2015/wordml/symex" xmlns:wpg="http://schemas.microsoft.com/office/word/2010/wordprocessingGroup" xmlns:wpi="http://schemas.microsoft.com/office/word/2010/wordprocessingInk" xmlns:wne="http://schemas.microsoft.com/office/word/2006/wordml" xmlns:wps="http://schemas.microsoft.com/office/word/2010/wordprocessingShape" mc:Ignorable="w14 w15 w16se w16cid w16 w16cex w16sdtdh w16sdtfl w16du wp14">
   <w:footnote w:type="separator" w:id="-1">
     <w:p>
       <w:r>
@@ -3654,10 +3583,10 @@
 </file>
 
 <file path=word/header1.xml><?xml version="1.0" encoding="utf-8"?>
-<w:hdr xmlns:wpc="http://schemas.microsoft.com/office/word/2010/wordprocessingCanvas" xmlns:cx="http://schemas.microsoft.com/office/drawing/2014/chartex" xmlns:cx1="http://schemas.microsoft.com/office/drawing/2015/9/8/chartex" xmlns:cx2="http://schemas.microsoft.com/office/drawing/2015/10/21/chartex" xmlns:cx3="http://schemas.microsoft.com/office/drawing/2016/5/9/chartex" xmlns:cx4="http://schemas.microsoft.com/office/drawing/2016/5/10/chartex" xmlns:cx5="http://schemas.microsoft.com/office/drawing/2016/5/11/chartex" xmlns:cx6="http://schemas.microsoft.com/office/drawing/2016/5/12/chartex" xmlns:cx7="http://schemas.microsoft.com/office/drawing/2016/5/13/chartex" xmlns:cx8="http://schemas.microsoft.com/office/drawing/2016/5/14/chartex" xmlns:mc="http://schemas.openxmlformats.org/markup-compatibility/2006" xmlns:aink="http://schemas.microsoft.com/office/drawing/2016/ink" xmlns:am3d="http://schemas.microsoft.com/office/drawing/2017/model3d" xmlns:o="urn:schemas-microsoft-com:office:office" xmlns:oel="http://schemas.microsoft.com/office/2019/extlst" xmlns:r="http://schemas.openxmlformats.org/officeDocument/2006/relationships" xmlns:m="http://schemas.openxmlformats.org/officeDocument/2006/math" xmlns:v="urn:schemas-microsoft-com:vml" xmlns:wp14="http://schemas.microsoft.com/office/word/2010/wordprocessingDrawing" xmlns:wp="http://schemas.openxmlformats.org/drawingml/2006/wordprocessingDrawing" xmlns:w10="urn:schemas-microsoft-com:office:word" xmlns:w="http://schemas.openxmlformats.org/wordprocessingml/2006/main" xmlns:w14="http://schemas.microsoft.com/office/word/2010/wordml" xmlns:w15="http://schemas.microsoft.com/office/word/2012/wordml" xmlns:w16cex="http://schemas.microsoft.com/office/word/2018/wordml/cex" xmlns:w16cid="http://schemas.microsoft.com/office/word/2016/wordml/cid" xmlns:w16="http://schemas.microsoft.com/office/word/2018/wordml" xmlns:w16du="http://schemas.microsoft.com/office/word/2023/wordml/word16du" xmlns:w16sdtdh="http://schemas.microsoft.com/office/word/2020/wordml/sdtdatahash" xmlns:w16se="http://schemas.microsoft.com/office/word/2015/wordml/symex" xmlns:wpg="http://schemas.microsoft.com/office/word/2010/wordprocessingGroup" xmlns:wpi="http://schemas.microsoft.com/office/word/2010/wordprocessingInk" xmlns:wne="http://schemas.microsoft.com/office/word/2006/wordml" xmlns:wps="http://schemas.microsoft.com/office/word/2010/wordprocessingShape" mc:Ignorable="w14 w15 w16se w16cid w16 w16cex w16sdtdh wp14">
+<w:hdr xmlns:wpc="http://schemas.microsoft.com/office/word/2010/wordprocessingCanvas" xmlns:cx="http://schemas.microsoft.com/office/drawing/2014/chartex" xmlns:cx1="http://schemas.microsoft.com/office/drawing/2015/9/8/chartex" xmlns:cx2="http://schemas.microsoft.com/office/drawing/2015/10/21/chartex" xmlns:cx3="http://schemas.microsoft.com/office/drawing/2016/5/9/chartex" xmlns:cx4="http://schemas.microsoft.com/office/drawing/2016/5/10/chartex" xmlns:cx5="http://schemas.microsoft.com/office/drawing/2016/5/11/chartex" xmlns:cx6="http://schemas.microsoft.com/office/drawing/2016/5/12/chartex" xmlns:cx7="http://schemas.microsoft.com/office/drawing/2016/5/13/chartex" xmlns:cx8="http://schemas.microsoft.com/office/drawing/2016/5/14/chartex" xmlns:mc="http://schemas.openxmlformats.org/markup-compatibility/2006" xmlns:aink="http://schemas.microsoft.com/office/drawing/2016/ink" xmlns:am3d="http://schemas.microsoft.com/office/drawing/2017/model3d" xmlns:o="urn:schemas-microsoft-com:office:office" xmlns:oel="http://schemas.microsoft.com/office/2019/extlst" xmlns:r="http://schemas.openxmlformats.org/officeDocument/2006/relationships" xmlns:m="http://schemas.openxmlformats.org/officeDocument/2006/math" xmlns:v="urn:schemas-microsoft-com:vml" xmlns:wp14="http://schemas.microsoft.com/office/word/2010/wordprocessingDrawing" xmlns:wp="http://schemas.openxmlformats.org/drawingml/2006/wordprocessingDrawing" xmlns:w10="urn:schemas-microsoft-com:office:word" xmlns:w="http://schemas.openxmlformats.org/wordprocessingml/2006/main" xmlns:w14="http://schemas.microsoft.com/office/word/2010/wordml" xmlns:w15="http://schemas.microsoft.com/office/word/2012/wordml" xmlns:w16cex="http://schemas.microsoft.com/office/word/2018/wordml/cex" xmlns:w16cid="http://schemas.microsoft.com/office/word/2016/wordml/cid" xmlns:w16="http://schemas.microsoft.com/office/word/2018/wordml" xmlns:w16du="http://schemas.microsoft.com/office/word/2023/wordml/word16du" xmlns:w16sdtdh="http://schemas.microsoft.com/office/word/2020/wordml/sdtdatahash" xmlns:w16sdtfl="http://schemas.microsoft.com/office/word/2024/wordml/sdtformatlock" xmlns:w16se="http://schemas.microsoft.com/office/word/2015/wordml/symex" xmlns:wpg="http://schemas.microsoft.com/office/word/2010/wordprocessingGroup" xmlns:wpi="http://schemas.microsoft.com/office/word/2010/wordprocessingInk" xmlns:wne="http://schemas.microsoft.com/office/word/2006/wordml" xmlns:wps="http://schemas.microsoft.com/office/word/2010/wordprocessingShape" mc:Ignorable="w14 w15 w16se w16cid w16 w16cex w16sdtdh w16sdtfl w16du wp14">
   <w:p>
     <w:pPr>
-      <w:pStyle w:val="Encabezado"/>
+      <w:pStyle w:val="Header"/>
     </w:pPr>
     <w:r>
       <w:rPr>
@@ -3694,10 +3623,10 @@
 </file>
 
 <file path=word/header2.xml><?xml version="1.0" encoding="utf-8"?>
-<w:hdr xmlns:wpc="http://schemas.microsoft.com/office/word/2010/wordprocessingCanvas" xmlns:cx="http://schemas.microsoft.com/office/drawing/2014/chartex" xmlns:cx1="http://schemas.microsoft.com/office/drawing/2015/9/8/chartex" xmlns:cx2="http://schemas.microsoft.com/office/drawing/2015/10/21/chartex" xmlns:cx3="http://schemas.microsoft.com/office/drawing/2016/5/9/chartex" xmlns:cx4="http://schemas.microsoft.com/office/drawing/2016/5/10/chartex" xmlns:cx5="http://schemas.microsoft.com/office/drawing/2016/5/11/chartex" xmlns:cx6="http://schemas.microsoft.com/office/drawing/2016/5/12/chartex" xmlns:cx7="http://schemas.microsoft.com/office/drawing/2016/5/13/chartex" xmlns:cx8="http://schemas.microsoft.com/office/drawing/2016/5/14/chartex" xmlns:mc="http://schemas.openxmlformats.org/markup-compatibility/2006" xmlns:aink="http://schemas.microsoft.com/office/drawing/2016/ink" xmlns:am3d="http://schemas.microsoft.com/office/drawing/2017/model3d" xmlns:o="urn:schemas-microsoft-com:office:office" xmlns:oel="http://schemas.microsoft.com/office/2019/extlst" xmlns:r="http://schemas.openxmlformats.org/officeDocument/2006/relationships" xmlns:m="http://schemas.openxmlformats.org/officeDocument/2006/math" xmlns:v="urn:schemas-microsoft-com:vml" xmlns:wp14="http://schemas.microsoft.com/office/word/2010/wordprocessingDrawing" xmlns:wp="http://schemas.openxmlformats.org/drawingml/2006/wordprocessingDrawing" xmlns:w10="urn:schemas-microsoft-com:office:word" xmlns:w="http://schemas.openxmlformats.org/wordprocessingml/2006/main" xmlns:w14="http://schemas.microsoft.com/office/word/2010/wordml" xmlns:w15="http://schemas.microsoft.com/office/word/2012/wordml" xmlns:w16cex="http://schemas.microsoft.com/office/word/2018/wordml/cex" xmlns:w16cid="http://schemas.microsoft.com/office/word/2016/wordml/cid" xmlns:w16="http://schemas.microsoft.com/office/word/2018/wordml" xmlns:w16du="http://schemas.microsoft.com/office/word/2023/wordml/word16du" xmlns:w16sdtdh="http://schemas.microsoft.com/office/word/2020/wordml/sdtdatahash" xmlns:w16se="http://schemas.microsoft.com/office/word/2015/wordml/symex" xmlns:wpg="http://schemas.microsoft.com/office/word/2010/wordprocessingGroup" xmlns:wpi="http://schemas.microsoft.com/office/word/2010/wordprocessingInk" xmlns:wne="http://schemas.microsoft.com/office/word/2006/wordml" xmlns:wps="http://schemas.microsoft.com/office/word/2010/wordprocessingShape" mc:Ignorable="w14 w15 w16se w16cid w16 w16cex w16sdtdh wp14">
+<w:hdr xmlns:wpc="http://schemas.microsoft.com/office/word/2010/wordprocessingCanvas" xmlns:cx="http://schemas.microsoft.com/office/drawing/2014/chartex" xmlns:cx1="http://schemas.microsoft.com/office/drawing/2015/9/8/chartex" xmlns:cx2="http://schemas.microsoft.com/office/drawing/2015/10/21/chartex" xmlns:cx3="http://schemas.microsoft.com/office/drawing/2016/5/9/chartex" xmlns:cx4="http://schemas.microsoft.com/office/drawing/2016/5/10/chartex" xmlns:cx5="http://schemas.microsoft.com/office/drawing/2016/5/11/chartex" xmlns:cx6="http://schemas.microsoft.com/office/drawing/2016/5/12/chartex" xmlns:cx7="http://schemas.microsoft.com/office/drawing/2016/5/13/chartex" xmlns:cx8="http://schemas.microsoft.com/office/drawing/2016/5/14/chartex" xmlns:mc="http://schemas.openxmlformats.org/markup-compatibility/2006" xmlns:aink="http://schemas.microsoft.com/office/drawing/2016/ink" xmlns:am3d="http://schemas.microsoft.com/office/drawing/2017/model3d" xmlns:o="urn:schemas-microsoft-com:office:office" xmlns:oel="http://schemas.microsoft.com/office/2019/extlst" xmlns:r="http://schemas.openxmlformats.org/officeDocument/2006/relationships" xmlns:m="http://schemas.openxmlformats.org/officeDocument/2006/math" xmlns:v="urn:schemas-microsoft-com:vml" xmlns:wp14="http://schemas.microsoft.com/office/word/2010/wordprocessingDrawing" xmlns:wp="http://schemas.openxmlformats.org/drawingml/2006/wordprocessingDrawing" xmlns:w10="urn:schemas-microsoft-com:office:word" xmlns:w="http://schemas.openxmlformats.org/wordprocessingml/2006/main" xmlns:w14="http://schemas.microsoft.com/office/word/2010/wordml" xmlns:w15="http://schemas.microsoft.com/office/word/2012/wordml" xmlns:w16cex="http://schemas.microsoft.com/office/word/2018/wordml/cex" xmlns:w16cid="http://schemas.microsoft.com/office/word/2016/wordml/cid" xmlns:w16="http://schemas.microsoft.com/office/word/2018/wordml" xmlns:w16du="http://schemas.microsoft.com/office/word/2023/wordml/word16du" xmlns:w16sdtdh="http://schemas.microsoft.com/office/word/2020/wordml/sdtdatahash" xmlns:w16sdtfl="http://schemas.microsoft.com/office/word/2024/wordml/sdtformatlock" xmlns:w16se="http://schemas.microsoft.com/office/word/2015/wordml/symex" xmlns:wpg="http://schemas.microsoft.com/office/word/2010/wordprocessingGroup" xmlns:wpi="http://schemas.microsoft.com/office/word/2010/wordprocessingInk" xmlns:wne="http://schemas.microsoft.com/office/word/2006/wordml" xmlns:wps="http://schemas.microsoft.com/office/word/2010/wordprocessingShape" mc:Ignorable="w14 w15 w16se w16cid w16 w16cex w16sdtdh w16sdtfl w16du wp14">
   <w:p>
     <w:pPr>
-      <w:pStyle w:val="Encabezado"/>
+      <w:pStyle w:val="Header"/>
     </w:pPr>
     <w:r>
       <w:rPr>
@@ -3734,10 +3663,10 @@
 </file>
 
 <file path=word/header3.xml><?xml version="1.0" encoding="utf-8"?>
-<w:hdr xmlns:wpc="http://schemas.microsoft.com/office/word/2010/wordprocessingCanvas" xmlns:cx="http://schemas.microsoft.com/office/drawing/2014/chartex" xmlns:cx1="http://schemas.microsoft.com/office/drawing/2015/9/8/chartex" xmlns:cx2="http://schemas.microsoft.com/office/drawing/2015/10/21/chartex" xmlns:cx3="http://schemas.microsoft.com/office/drawing/2016/5/9/chartex" xmlns:cx4="http://schemas.microsoft.com/office/drawing/2016/5/10/chartex" xmlns:cx5="http://schemas.microsoft.com/office/drawing/2016/5/11/chartex" xmlns:cx6="http://schemas.microsoft.com/office/drawing/2016/5/12/chartex" xmlns:cx7="http://schemas.microsoft.com/office/drawing/2016/5/13/chartex" xmlns:cx8="http://schemas.microsoft.com/office/drawing/2016/5/14/chartex" xmlns:mc="http://schemas.openxmlformats.org/markup-compatibility/2006" xmlns:aink="http://schemas.microsoft.com/office/drawing/2016/ink" xmlns:am3d="http://schemas.microsoft.com/office/drawing/2017/model3d" xmlns:o="urn:schemas-microsoft-com:office:office" xmlns:oel="http://schemas.microsoft.com/office/2019/extlst" xmlns:r="http://schemas.openxmlformats.org/officeDocument/2006/relationships" xmlns:m="http://schemas.openxmlformats.org/officeDocument/2006/math" xmlns:v="urn:schemas-microsoft-com:vml" xmlns:wp14="http://schemas.microsoft.com/office/word/2010/wordprocessingDrawing" xmlns:wp="http://schemas.openxmlformats.org/drawingml/2006/wordprocessingDrawing" xmlns:w10="urn:schemas-microsoft-com:office:word" xmlns:w="http://schemas.openxmlformats.org/wordprocessingml/2006/main" xmlns:w14="http://schemas.microsoft.com/office/word/2010/wordml" xmlns:w15="http://schemas.microsoft.com/office/word/2012/wordml" xmlns:w16cex="http://schemas.microsoft.com/office/word/2018/wordml/cex" xmlns:w16cid="http://schemas.microsoft.com/office/word/2016/wordml/cid" xmlns:w16="http://schemas.microsoft.com/office/word/2018/wordml" xmlns:w16du="http://schemas.microsoft.com/office/word/2023/wordml/word16du" xmlns:w16sdtdh="http://schemas.microsoft.com/office/word/2020/wordml/sdtdatahash" xmlns:w16se="http://schemas.microsoft.com/office/word/2015/wordml/symex" xmlns:wpg="http://schemas.microsoft.com/office/word/2010/wordprocessingGroup" xmlns:wpi="http://schemas.microsoft.com/office/word/2010/wordprocessingInk" xmlns:wne="http://schemas.microsoft.com/office/word/2006/wordml" xmlns:wps="http://schemas.microsoft.com/office/word/2010/wordprocessingShape" mc:Ignorable="w14 w15 w16se w16cid w16 w16cex w16sdtdh wp14">
+<w:hdr xmlns:wpc="http://schemas.microsoft.com/office/word/2010/wordprocessingCanvas" xmlns:cx="http://schemas.microsoft.com/office/drawing/2014/chartex" xmlns:cx1="http://schemas.microsoft.com/office/drawing/2015/9/8/chartex" xmlns:cx2="http://schemas.microsoft.com/office/drawing/2015/10/21/chartex" xmlns:cx3="http://schemas.microsoft.com/office/drawing/2016/5/9/chartex" xmlns:cx4="http://schemas.microsoft.com/office/drawing/2016/5/10/chartex" xmlns:cx5="http://schemas.microsoft.com/office/drawing/2016/5/11/chartex" xmlns:cx6="http://schemas.microsoft.com/office/drawing/2016/5/12/chartex" xmlns:cx7="http://schemas.microsoft.com/office/drawing/2016/5/13/chartex" xmlns:cx8="http://schemas.microsoft.com/office/drawing/2016/5/14/chartex" xmlns:mc="http://schemas.openxmlformats.org/markup-compatibility/2006" xmlns:aink="http://schemas.microsoft.com/office/drawing/2016/ink" xmlns:am3d="http://schemas.microsoft.com/office/drawing/2017/model3d" xmlns:o="urn:schemas-microsoft-com:office:office" xmlns:oel="http://schemas.microsoft.com/office/2019/extlst" xmlns:r="http://schemas.openxmlformats.org/officeDocument/2006/relationships" xmlns:m="http://schemas.openxmlformats.org/officeDocument/2006/math" xmlns:v="urn:schemas-microsoft-com:vml" xmlns:wp14="http://schemas.microsoft.com/office/word/2010/wordprocessingDrawing" xmlns:wp="http://schemas.openxmlformats.org/drawingml/2006/wordprocessingDrawing" xmlns:w10="urn:schemas-microsoft-com:office:word" xmlns:w="http://schemas.openxmlformats.org/wordprocessingml/2006/main" xmlns:w14="http://schemas.microsoft.com/office/word/2010/wordml" xmlns:w15="http://schemas.microsoft.com/office/word/2012/wordml" xmlns:w16cex="http://schemas.microsoft.com/office/word/2018/wordml/cex" xmlns:w16cid="http://schemas.microsoft.com/office/word/2016/wordml/cid" xmlns:w16="http://schemas.microsoft.com/office/word/2018/wordml" xmlns:w16du="http://schemas.microsoft.com/office/word/2023/wordml/word16du" xmlns:w16sdtdh="http://schemas.microsoft.com/office/word/2020/wordml/sdtdatahash" xmlns:w16sdtfl="http://schemas.microsoft.com/office/word/2024/wordml/sdtformatlock" xmlns:w16se="http://schemas.microsoft.com/office/word/2015/wordml/symex" xmlns:wpg="http://schemas.microsoft.com/office/word/2010/wordprocessingGroup" xmlns:wpi="http://schemas.microsoft.com/office/word/2010/wordprocessingInk" xmlns:wne="http://schemas.microsoft.com/office/word/2006/wordml" xmlns:wps="http://schemas.microsoft.com/office/word/2010/wordprocessingShape" mc:Ignorable="w14 w15 w16se w16cid w16 w16cex w16sdtdh w16sdtfl w16du wp14">
   <w:p>
     <w:pPr>
-      <w:pStyle w:val="Encabezado"/>
+      <w:pStyle w:val="Header"/>
     </w:pPr>
     <w:r>
       <w:rPr>
@@ -3774,7 +3703,7 @@
 </file>
 
 <file path=word/numbering.xml><?xml version="1.0" encoding="utf-8"?>
-<w:numbering xmlns:wpc="http://schemas.microsoft.com/office/word/2010/wordprocessingCanvas" xmlns:cx="http://schemas.microsoft.com/office/drawing/2014/chartex" xmlns:cx1="http://schemas.microsoft.com/office/drawing/2015/9/8/chartex" xmlns:cx2="http://schemas.microsoft.com/office/drawing/2015/10/21/chartex" xmlns:cx3="http://schemas.microsoft.com/office/drawing/2016/5/9/chartex" xmlns:cx4="http://schemas.microsoft.com/office/drawing/2016/5/10/chartex" xmlns:cx5="http://schemas.microsoft.com/office/drawing/2016/5/11/chartex" xmlns:cx6="http://schemas.microsoft.com/office/drawing/2016/5/12/chartex" xmlns:cx7="http://schemas.microsoft.com/office/drawing/2016/5/13/chartex" xmlns:cx8="http://schemas.microsoft.com/office/drawing/2016/5/14/chartex" xmlns:mc="http://schemas.openxmlformats.org/markup-compatibility/2006" xmlns:aink="http://schemas.microsoft.com/office/drawing/2016/ink" xmlns:am3d="http://schemas.microsoft.com/office/drawing/2017/model3d" xmlns:o="urn:schemas-microsoft-com:office:office" xmlns:oel="http://schemas.microsoft.com/office/2019/extlst" xmlns:r="http://schemas.openxmlformats.org/officeDocument/2006/relationships" xmlns:m="http://schemas.openxmlformats.org/officeDocument/2006/math" xmlns:v="urn:schemas-microsoft-com:vml" xmlns:wp14="http://schemas.microsoft.com/office/word/2010/wordprocessingDrawing" xmlns:wp="http://schemas.openxmlformats.org/drawingml/2006/wordprocessingDrawing" xmlns:w10="urn:schemas-microsoft-com:office:word" xmlns:w="http://schemas.openxmlformats.org/wordprocessingml/2006/main" xmlns:w14="http://schemas.microsoft.com/office/word/2010/wordml" xmlns:w15="http://schemas.microsoft.com/office/word/2012/wordml" xmlns:w16cex="http://schemas.microsoft.com/office/word/2018/wordml/cex" xmlns:w16cid="http://schemas.microsoft.com/office/word/2016/wordml/cid" xmlns:w16="http://schemas.microsoft.com/office/word/2018/wordml" xmlns:w16du="http://schemas.microsoft.com/office/word/2023/wordml/word16du" xmlns:w16sdtdh="http://schemas.microsoft.com/office/word/2020/wordml/sdtdatahash" xmlns:w16se="http://schemas.microsoft.com/office/word/2015/wordml/symex" xmlns:wpg="http://schemas.microsoft.com/office/word/2010/wordprocessingGroup" xmlns:wpi="http://schemas.microsoft.com/office/word/2010/wordprocessingInk" xmlns:wne="http://schemas.microsoft.com/office/word/2006/wordml" xmlns:wps="http://schemas.microsoft.com/office/word/2010/wordprocessingShape" mc:Ignorable="w14 w15 w16se w16cid w16 w16cex w16sdtdh wp14">
+<w:numbering xmlns:wpc="http://schemas.microsoft.com/office/word/2010/wordprocessingCanvas" xmlns:cx="http://schemas.microsoft.com/office/drawing/2014/chartex" xmlns:cx1="http://schemas.microsoft.com/office/drawing/2015/9/8/chartex" xmlns:cx2="http://schemas.microsoft.com/office/drawing/2015/10/21/chartex" xmlns:cx3="http://schemas.microsoft.com/office/drawing/2016/5/9/chartex" xmlns:cx4="http://schemas.microsoft.com/office/drawing/2016/5/10/chartex" xmlns:cx5="http://schemas.microsoft.com/office/drawing/2016/5/11/chartex" xmlns:cx6="http://schemas.microsoft.com/office/drawing/2016/5/12/chartex" xmlns:cx7="http://schemas.microsoft.com/office/drawing/2016/5/13/chartex" xmlns:cx8="http://schemas.microsoft.com/office/drawing/2016/5/14/chartex" xmlns:mc="http://schemas.openxmlformats.org/markup-compatibility/2006" xmlns:aink="http://schemas.microsoft.com/office/drawing/2016/ink" xmlns:am3d="http://schemas.microsoft.com/office/drawing/2017/model3d" xmlns:o="urn:schemas-microsoft-com:office:office" xmlns:oel="http://schemas.microsoft.com/office/2019/extlst" xmlns:r="http://schemas.openxmlformats.org/officeDocument/2006/relationships" xmlns:m="http://schemas.openxmlformats.org/officeDocument/2006/math" xmlns:v="urn:schemas-microsoft-com:vml" xmlns:wp14="http://schemas.microsoft.com/office/word/2010/wordprocessingDrawing" xmlns:wp="http://schemas.openxmlformats.org/drawingml/2006/wordprocessingDrawing" xmlns:w10="urn:schemas-microsoft-com:office:word" xmlns:w="http://schemas.openxmlformats.org/wordprocessingml/2006/main" xmlns:w14="http://schemas.microsoft.com/office/word/2010/wordml" xmlns:w15="http://schemas.microsoft.com/office/word/2012/wordml" xmlns:w16cex="http://schemas.microsoft.com/office/word/2018/wordml/cex" xmlns:w16cid="http://schemas.microsoft.com/office/word/2016/wordml/cid" xmlns:w16="http://schemas.microsoft.com/office/word/2018/wordml" xmlns:w16du="http://schemas.microsoft.com/office/word/2023/wordml/word16du" xmlns:w16sdtdh="http://schemas.microsoft.com/office/word/2020/wordml/sdtdatahash" xmlns:w16sdtfl="http://schemas.microsoft.com/office/word/2024/wordml/sdtformatlock" xmlns:w16se="http://schemas.microsoft.com/office/word/2015/wordml/symex" xmlns:wpg="http://schemas.microsoft.com/office/word/2010/wordprocessingGroup" xmlns:wpi="http://schemas.microsoft.com/office/word/2010/wordprocessingInk" xmlns:wne="http://schemas.microsoft.com/office/word/2006/wordml" xmlns:wps="http://schemas.microsoft.com/office/word/2010/wordprocessingShape" mc:Ignorable="w14 w15 w16se w16cid w16 w16cex w16sdtdh w16sdtfl w16du wp14">
   <w:abstractNum w:abstractNumId="0" w15:restartNumberingAfterBreak="0">
     <w:nsid w:val="0B9D3011"/>
     <w:multiLevelType w:val="hybridMultilevel"/>
@@ -4355,7 +4284,7 @@
 </file>
 
 <file path=word/styles.xml><?xml version="1.0" encoding="utf-8"?>
-<w:styles xmlns:mc="http://schemas.openxmlformats.org/markup-compatibility/2006" xmlns:r="http://schemas.openxmlformats.org/officeDocument/2006/relationships" xmlns:w="http://schemas.openxmlformats.org/wordprocessingml/2006/main" xmlns:w14="http://schemas.microsoft.com/office/word/2010/wordml" xmlns:w15="http://schemas.microsoft.com/office/word/2012/wordml" xmlns:w16cex="http://schemas.microsoft.com/office/word/2018/wordml/cex" xmlns:w16cid="http://schemas.microsoft.com/office/word/2016/wordml/cid" xmlns:w16="http://schemas.microsoft.com/office/word/2018/wordml" xmlns:w16sdtdh="http://schemas.microsoft.com/office/word/2020/wordml/sdtdatahash" xmlns:w16se="http://schemas.microsoft.com/office/word/2015/wordml/symex" mc:Ignorable="w14 w15 w16se w16cid w16 w16cex w16sdtdh">
+<w:styles xmlns:mc="http://schemas.openxmlformats.org/markup-compatibility/2006" xmlns:r="http://schemas.openxmlformats.org/officeDocument/2006/relationships" xmlns:w="http://schemas.openxmlformats.org/wordprocessingml/2006/main" xmlns:w14="http://schemas.microsoft.com/office/word/2010/wordml" xmlns:w15="http://schemas.microsoft.com/office/word/2012/wordml" xmlns:w16cex="http://schemas.microsoft.com/office/word/2018/wordml/cex" xmlns:w16cid="http://schemas.microsoft.com/office/word/2016/wordml/cid" xmlns:w16="http://schemas.microsoft.com/office/word/2018/wordml" xmlns:w16du="http://schemas.microsoft.com/office/word/2023/wordml/word16du" xmlns:w16sdtdh="http://schemas.microsoft.com/office/word/2020/wordml/sdtdatahash" xmlns:w16sdtfl="http://schemas.microsoft.com/office/word/2024/wordml/sdtformatlock" xmlns:w16se="http://schemas.microsoft.com/office/word/2015/wordml/symex" mc:Ignorable="w14 w15 w16se w16cid w16 w16cex w16sdtdh w16sdtfl w16du">
   <w:docDefaults>
     <w:rPrDefault>
       <w:rPr>
@@ -4763,13 +4692,13 @@
       <w:lang w:eastAsia="es-ES"/>
     </w:rPr>
   </w:style>
-  <w:style w:type="character" w:default="1" w:styleId="Fuentedeprrafopredeter">
+  <w:style w:type="character" w:default="1" w:styleId="DefaultParagraphFont">
     <w:name w:val="Default Paragraph Font"/>
     <w:uiPriority w:val="1"/>
     <w:semiHidden/>
     <w:unhideWhenUsed/>
   </w:style>
-  <w:style w:type="table" w:default="1" w:styleId="Tablanormal">
+  <w:style w:type="table" w:default="1" w:styleId="TableNormal">
     <w:name w:val="Normal Table"/>
     <w:uiPriority w:val="99"/>
     <w:semiHidden/>
@@ -4784,16 +4713,16 @@
       </w:tblCellMar>
     </w:tblPr>
   </w:style>
-  <w:style w:type="numbering" w:default="1" w:styleId="Sinlista">
+  <w:style w:type="numbering" w:default="1" w:styleId="NoList">
     <w:name w:val="No List"/>
     <w:uiPriority w:val="99"/>
     <w:semiHidden/>
     <w:unhideWhenUsed/>
   </w:style>
-  <w:style w:type="paragraph" w:styleId="Encabezado">
+  <w:style w:type="paragraph" w:styleId="Header">
     <w:name w:val="header"/>
     <w:basedOn w:val="Normal"/>
-    <w:link w:val="EncabezadoCar"/>
+    <w:link w:val="HeaderChar"/>
     <w:uiPriority w:val="99"/>
     <w:unhideWhenUsed/>
     <w:rsid w:val="004C51BE"/>
@@ -4810,17 +4739,17 @@
       <w:lang w:eastAsia="en-US"/>
     </w:rPr>
   </w:style>
-  <w:style w:type="character" w:customStyle="1" w:styleId="EncabezadoCar">
-    <w:name w:val="Encabezado Car"/>
-    <w:basedOn w:val="Fuentedeprrafopredeter"/>
-    <w:link w:val="Encabezado"/>
+  <w:style w:type="character" w:customStyle="1" w:styleId="HeaderChar">
+    <w:name w:val="Header Char"/>
+    <w:basedOn w:val="DefaultParagraphFont"/>
+    <w:link w:val="Header"/>
     <w:uiPriority w:val="99"/>
     <w:rsid w:val="004C51BE"/>
   </w:style>
-  <w:style w:type="paragraph" w:styleId="Piedepgina">
+  <w:style w:type="paragraph" w:styleId="Footer">
     <w:name w:val="footer"/>
     <w:basedOn w:val="Normal"/>
-    <w:link w:val="PiedepginaCar"/>
+    <w:link w:val="FooterChar"/>
     <w:uiPriority w:val="99"/>
     <w:unhideWhenUsed/>
     <w:rsid w:val="004C51BE"/>
@@ -4837,16 +4766,16 @@
       <w:lang w:eastAsia="en-US"/>
     </w:rPr>
   </w:style>
-  <w:style w:type="character" w:customStyle="1" w:styleId="PiedepginaCar">
-    <w:name w:val="Pie de página Car"/>
-    <w:basedOn w:val="Fuentedeprrafopredeter"/>
-    <w:link w:val="Piedepgina"/>
+  <w:style w:type="character" w:customStyle="1" w:styleId="FooterChar">
+    <w:name w:val="Footer Char"/>
+    <w:basedOn w:val="DefaultParagraphFont"/>
+    <w:link w:val="Footer"/>
     <w:uiPriority w:val="99"/>
     <w:rsid w:val="004C51BE"/>
   </w:style>
-  <w:style w:type="paragraph" w:styleId="Sinespaciado">
+  <w:style w:type="paragraph" w:styleId="NoSpacing">
     <w:name w:val="No Spacing"/>
-    <w:link w:val="SinespaciadoCar"/>
+    <w:link w:val="NoSpacingChar"/>
     <w:uiPriority w:val="1"/>
     <w:qFormat/>
     <w:rsid w:val="005078DA"/>
@@ -4857,10 +4786,10 @@
       <w:lang w:val="es-EC"/>
     </w:rPr>
   </w:style>
-  <w:style w:type="character" w:customStyle="1" w:styleId="SinespaciadoCar">
-    <w:name w:val="Sin espaciado Car"/>
-    <w:basedOn w:val="Fuentedeprrafopredeter"/>
-    <w:link w:val="Sinespaciado"/>
+  <w:style w:type="character" w:customStyle="1" w:styleId="NoSpacingChar">
+    <w:name w:val="No Spacing Char"/>
+    <w:basedOn w:val="DefaultParagraphFont"/>
+    <w:link w:val="NoSpacing"/>
     <w:uiPriority w:val="1"/>
     <w:locked/>
     <w:rsid w:val="005078DA"/>
@@ -4868,9 +4797,9 @@
       <w:lang w:val="es-EC"/>
     </w:rPr>
   </w:style>
-  <w:style w:type="table" w:styleId="Tablaconcuadrcula">
+  <w:style w:type="table" w:styleId="TableGrid">
     <w:name w:val="Table Grid"/>
-    <w:basedOn w:val="Tablanormal"/>
+    <w:basedOn w:val="TableNormal"/>
     <w:uiPriority w:val="59"/>
     <w:rsid w:val="005078DA"/>
     <w:pPr>
@@ -4887,10 +4816,10 @@
       </w:tblBorders>
     </w:tblPr>
   </w:style>
-  <w:style w:type="paragraph" w:styleId="Textodeglobo">
+  <w:style w:type="paragraph" w:styleId="BalloonText">
     <w:name w:val="Balloon Text"/>
     <w:basedOn w:val="Normal"/>
-    <w:link w:val="TextodegloboCar"/>
+    <w:link w:val="BalloonTextChar"/>
     <w:uiPriority w:val="99"/>
     <w:semiHidden/>
     <w:unhideWhenUsed/>
@@ -4901,10 +4830,10 @@
       <w:szCs w:val="18"/>
     </w:rPr>
   </w:style>
-  <w:style w:type="character" w:customStyle="1" w:styleId="TextodegloboCar">
-    <w:name w:val="Texto de globo Car"/>
-    <w:basedOn w:val="Fuentedeprrafopredeter"/>
-    <w:link w:val="Textodeglobo"/>
+  <w:style w:type="character" w:customStyle="1" w:styleId="BalloonTextChar">
+    <w:name w:val="Balloon Text Char"/>
+    <w:basedOn w:val="DefaultParagraphFont"/>
+    <w:link w:val="BalloonText"/>
     <w:uiPriority w:val="99"/>
     <w:semiHidden/>
     <w:rsid w:val="000B45E7"/>
@@ -4927,7 +4856,7 @@
       <w:lang w:val="es-EC" w:eastAsia="es-EC"/>
     </w:rPr>
   </w:style>
-  <w:style w:type="paragraph" w:styleId="Prrafodelista">
+  <w:style w:type="paragraph" w:styleId="ListParagraph">
     <w:name w:val="List Paragraph"/>
     <w:basedOn w:val="Normal"/>
     <w:uiPriority w:val="34"/>
@@ -5237,11 +5166,12 @@
 </file>
 
 <file path=customXml/item1.xml><?xml version="1.0" encoding="utf-8"?>
-<p:properties xmlns:p="http://schemas.microsoft.com/office/2006/metadata/properties" xmlns:xsi="http://www.w3.org/2001/XMLSchema-instance" xmlns:pc="http://schemas.microsoft.com/office/infopath/2007/PartnerControls">
-  <documentManagement>
-    <_activity xmlns="f1fd4f5f-a887-4536-8473-96cb4bd6ae39" xsi:nil="true"/>
-  </documentManagement>
-</p:properties>
+<?mso-contentType ?>
+<FormTemplates xmlns="http://schemas.microsoft.com/sharepoint/v3/contenttype/forms">
+  <Display>DocumentLibraryForm</Display>
+  <Edit>DocumentLibraryForm</Edit>
+  <New>DocumentLibraryForm</New>
+</FormTemplates>
 </file>
 
 <file path=customXml/item2.xml><?xml version="1.0" encoding="utf-8"?>
@@ -5498,20 +5428,17 @@
 </file>
 
 <file path=customXml/item3.xml><?xml version="1.0" encoding="utf-8"?>
-<?mso-contentType ?>
-<FormTemplates xmlns="http://schemas.microsoft.com/sharepoint/v3/contenttype/forms">
-  <Display>DocumentLibraryForm</Display>
-  <Edit>DocumentLibraryForm</Edit>
-  <New>DocumentLibraryForm</New>
-</FormTemplates>
+<p:properties xmlns:p="http://schemas.microsoft.com/office/2006/metadata/properties" xmlns:xsi="http://www.w3.org/2001/XMLSchema-instance" xmlns:pc="http://schemas.microsoft.com/office/infopath/2007/PartnerControls">
+  <documentManagement>
+    <_activity xmlns="f1fd4f5f-a887-4536-8473-96cb4bd6ae39" xsi:nil="true"/>
+  </documentManagement>
+</p:properties>
 </file>
 
 <file path=customXml/itemProps1.xml><?xml version="1.0" encoding="utf-8"?>
-<ds:datastoreItem xmlns:ds="http://schemas.openxmlformats.org/officeDocument/2006/customXml" ds:itemID="{A86E6CDC-FA02-429E-B4F3-4499F0351A83}">
+<ds:datastoreItem xmlns:ds="http://schemas.openxmlformats.org/officeDocument/2006/customXml" ds:itemID="{B4A33F56-6D31-42E5-B0B0-758A64845536}">
   <ds:schemaRefs>
-    <ds:schemaRef ds:uri="http://schemas.microsoft.com/office/2006/metadata/properties"/>
-    <ds:schemaRef ds:uri="http://schemas.microsoft.com/office/infopath/2007/PartnerControls"/>
-    <ds:schemaRef ds:uri="f1fd4f5f-a887-4536-8473-96cb4bd6ae39"/>
+    <ds:schemaRef ds:uri="http://schemas.microsoft.com/sharepoint/v3/contenttype/forms"/>
   </ds:schemaRefs>
 </ds:datastoreItem>
 </file>
@@ -5536,9 +5463,11 @@
 </file>
 
 <file path=customXml/itemProps3.xml><?xml version="1.0" encoding="utf-8"?>
-<ds:datastoreItem xmlns:ds="http://schemas.openxmlformats.org/officeDocument/2006/customXml" ds:itemID="{B4A33F56-6D31-42E5-B0B0-758A64845536}">
+<ds:datastoreItem xmlns:ds="http://schemas.openxmlformats.org/officeDocument/2006/customXml" ds:itemID="{A86E6CDC-FA02-429E-B4F3-4499F0351A83}">
   <ds:schemaRefs>
-    <ds:schemaRef ds:uri="http://schemas.microsoft.com/sharepoint/v3/contenttype/forms"/>
+    <ds:schemaRef ds:uri="http://schemas.microsoft.com/office/2006/metadata/properties"/>
+    <ds:schemaRef ds:uri="http://schemas.microsoft.com/office/infopath/2007/PartnerControls"/>
+    <ds:schemaRef ds:uri="f1fd4f5f-a887-4536-8473-96cb4bd6ae39"/>
   </ds:schemaRefs>
 </ds:datastoreItem>
 </file>
</xml_diff>

<commit_message>
Implementación de PATs de Maestría, división de index.html en componentes; creación de html para futuro poner el acta técnica
</commit_message>
<xml_diff>
--- a/resources/Convocatoria_Docentes.docx
+++ b/resources/Convocatoria_Docentes.docx
@@ -1,6 +1,6 @@
 
 <file path=word/document.xml><?xml version="1.0" encoding="utf-8"?>
-<w:document xmlns:wpc="http://schemas.microsoft.com/office/word/2010/wordprocessingCanvas" xmlns:cx="http://schemas.microsoft.com/office/drawing/2014/chartex" xmlns:cx1="http://schemas.microsoft.com/office/drawing/2015/9/8/chartex" xmlns:cx2="http://schemas.microsoft.com/office/drawing/2015/10/21/chartex" xmlns:cx3="http://schemas.microsoft.com/office/drawing/2016/5/9/chartex" xmlns:cx4="http://schemas.microsoft.com/office/drawing/2016/5/10/chartex" xmlns:cx5="http://schemas.microsoft.com/office/drawing/2016/5/11/chartex" xmlns:cx6="http://schemas.microsoft.com/office/drawing/2016/5/12/chartex" xmlns:cx7="http://schemas.microsoft.com/office/drawing/2016/5/13/chartex" xmlns:cx8="http://schemas.microsoft.com/office/drawing/2016/5/14/chartex" xmlns:mc="http://schemas.openxmlformats.org/markup-compatibility/2006" xmlns:aink="http://schemas.microsoft.com/office/drawing/2016/ink" xmlns:am3d="http://schemas.microsoft.com/office/drawing/2017/model3d" xmlns:o="urn:schemas-microsoft-com:office:office" xmlns:oel="http://schemas.microsoft.com/office/2019/extlst" xmlns:r="http://schemas.openxmlformats.org/officeDocument/2006/relationships" xmlns:m="http://schemas.openxmlformats.org/officeDocument/2006/math" xmlns:v="urn:schemas-microsoft-com:vml" xmlns:wp14="http://schemas.microsoft.com/office/word/2010/wordprocessingDrawing" xmlns:wp="http://schemas.openxmlformats.org/drawingml/2006/wordprocessingDrawing" xmlns:w10="urn:schemas-microsoft-com:office:word" xmlns:w="http://schemas.openxmlformats.org/wordprocessingml/2006/main" xmlns:w14="http://schemas.microsoft.com/office/word/2010/wordml" xmlns:w15="http://schemas.microsoft.com/office/word/2012/wordml" xmlns:w16cex="http://schemas.microsoft.com/office/word/2018/wordml/cex" xmlns:w16cid="http://schemas.microsoft.com/office/word/2016/wordml/cid" xmlns:w16="http://schemas.microsoft.com/office/word/2018/wordml" xmlns:w16du="http://schemas.microsoft.com/office/word/2023/wordml/word16du" xmlns:w16sdtdh="http://schemas.microsoft.com/office/word/2020/wordml/sdtdatahash" xmlns:w16sdtfl="http://schemas.microsoft.com/office/word/2024/wordml/sdtformatlock" xmlns:w16se="http://schemas.microsoft.com/office/word/2015/wordml/symex" xmlns:wpg="http://schemas.microsoft.com/office/word/2010/wordprocessingGroup" xmlns:wpi="http://schemas.microsoft.com/office/word/2010/wordprocessingInk" xmlns:wne="http://schemas.microsoft.com/office/word/2006/wordml" xmlns:wps="http://schemas.microsoft.com/office/word/2010/wordprocessingShape" mc:Ignorable="w14 w15 w16se w16cid w16 w16cex w16sdtdh w16sdtfl w16du wp14">
+<w:document xmlns:wpc="http://schemas.microsoft.com/office/word/2010/wordprocessingCanvas" xmlns:cx="http://schemas.microsoft.com/office/drawing/2014/chartex" xmlns:cx1="http://schemas.microsoft.com/office/drawing/2015/9/8/chartex" xmlns:cx2="http://schemas.microsoft.com/office/drawing/2015/10/21/chartex" xmlns:cx3="http://schemas.microsoft.com/office/drawing/2016/5/9/chartex" xmlns:cx4="http://schemas.microsoft.com/office/drawing/2016/5/10/chartex" xmlns:cx5="http://schemas.microsoft.com/office/drawing/2016/5/11/chartex" xmlns:cx6="http://schemas.microsoft.com/office/drawing/2016/5/12/chartex" xmlns:cx7="http://schemas.microsoft.com/office/drawing/2016/5/13/chartex" xmlns:cx8="http://schemas.microsoft.com/office/drawing/2016/5/14/chartex" xmlns:mc="http://schemas.openxmlformats.org/markup-compatibility/2006" xmlns:aink="http://schemas.microsoft.com/office/drawing/2016/ink" xmlns:am3d="http://schemas.microsoft.com/office/drawing/2017/model3d" xmlns:o="urn:schemas-microsoft-com:office:office" xmlns:oel="http://schemas.microsoft.com/office/2019/extlst" xmlns:r="http://schemas.openxmlformats.org/officeDocument/2006/relationships" xmlns:m="http://schemas.openxmlformats.org/officeDocument/2006/math" xmlns:v="urn:schemas-microsoft-com:vml" xmlns:wp14="http://schemas.microsoft.com/office/word/2010/wordprocessingDrawing" xmlns:wp="http://schemas.openxmlformats.org/drawingml/2006/wordprocessingDrawing" xmlns:w10="urn:schemas-microsoft-com:office:word" xmlns:w="http://schemas.openxmlformats.org/wordprocessingml/2006/main" xmlns:w14="http://schemas.microsoft.com/office/word/2010/wordml" xmlns:w15="http://schemas.microsoft.com/office/word/2012/wordml" xmlns:w16cex="http://schemas.microsoft.com/office/word/2018/wordml/cex" xmlns:w16cid="http://schemas.microsoft.com/office/word/2016/wordml/cid" xmlns:w16="http://schemas.microsoft.com/office/word/2018/wordml" xmlns:w16du="http://schemas.microsoft.com/office/word/2023/wordml/word16du" xmlns:w16sdtdh="http://schemas.microsoft.com/office/word/2020/wordml/sdtdatahash" xmlns:w16se="http://schemas.microsoft.com/office/word/2015/wordml/symex" xmlns:wpg="http://schemas.microsoft.com/office/word/2010/wordprocessingGroup" xmlns:wpi="http://schemas.microsoft.com/office/word/2010/wordprocessingInk" xmlns:wne="http://schemas.microsoft.com/office/word/2006/wordml" xmlns:wps="http://schemas.microsoft.com/office/word/2010/wordprocessingShape" mc:Ignorable="w14 w15 w16se w16cid w16 w16cex w16sdtdh wp14">
   <w:body>
     <w:p>
       <w:pPr>
@@ -342,15 +342,15 @@
           <w:rFonts w:ascii="Verdana" w:hAnsi="Verdana" w:cstheme="minorHAnsi"/>
           <w:sz w:val="20"/>
           <w:szCs w:val="20"/>
-          <w:lang w:val="es-EC" w:eastAsia="es-EC"/>
-        </w:rPr>
-      </w:pPr>
-      <w:r>
-        <w:rPr>
-          <w:rFonts w:ascii="Verdana" w:hAnsi="Verdana" w:cstheme="minorHAnsi"/>
-          <w:sz w:val="20"/>
-          <w:szCs w:val="20"/>
-          <w:lang w:val="es-EC" w:eastAsia="es-EC"/>
+          <w:lang w:val="pt-BR" w:eastAsia="es-EC"/>
+        </w:rPr>
+      </w:pPr>
+      <w:r>
+        <w:rPr>
+          <w:rFonts w:ascii="Verdana" w:hAnsi="Verdana" w:cstheme="minorHAnsi"/>
+          <w:sz w:val="20"/>
+          <w:szCs w:val="20"/>
+          <w:lang w:val="pt-BR" w:eastAsia="es-EC"/>
         </w:rPr>
         <w:t>Lic. Laura Mena Sánchez, Mg.</w:t>
       </w:r>
@@ -580,7 +580,7 @@
               </wp:anchor>
             </w:drawing>
           </mc:Choice>
-          <mc:Fallback>
+          <mc:Fallback xmlns:w16sdtfl="http://schemas.microsoft.com/office/word/2024/wordml/sdtformatlock">
             <w:pict>
               <v:line w14:anchorId="3B98C0A2" id="Conector recto 579588014" o:spid="_x0000_s1026" style="position:absolute;flip:y;z-index:251661312;visibility:visible;mso-wrap-style:square;mso-width-percent:0;mso-height-percent:0;mso-wrap-distance-left:9pt;mso-wrap-distance-top:0;mso-wrap-distance-right:9pt;mso-wrap-distance-bottom:0;mso-position-horizontal:absolute;mso-position-horizontal-relative:margin;mso-position-vertical:absolute;mso-position-vertical-relative:text;mso-width-percent:0;mso-height-percent:0;mso-width-relative:margin;mso-height-relative:margin" from="-1.05pt,7.15pt" to="429.45pt,8.65pt" o:gfxdata="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" strokecolor="black [3200]">
                 <v:stroke dashstyle="dash"/>
@@ -1011,7 +1011,7 @@
     </w:p>
     <w:tbl>
       <w:tblPr>
-        <w:tblStyle w:val="TableGrid"/>
+        <w:tblStyle w:val="Tablaconcuadrcula"/>
         <w:tblW w:w="8926" w:type="dxa"/>
         <w:tblLook w:val="04A0" w:firstRow="1" w:lastRow="0" w:firstColumn="1" w:lastColumn="0" w:noHBand="0" w:noVBand="1"/>
       </w:tblPr>
@@ -1916,7 +1916,7 @@
           <w:sz w:val="20"/>
           <w:szCs w:val="20"/>
         </w:rPr>
-        <w:t>DCPINE</w:t>
+        <w:t>DC</w:t>
       </w:r>
       <w:r>
         <w:rPr>
@@ -2111,7 +2111,7 @@
     </w:p>
     <w:tbl>
       <w:tblPr>
-        <w:tblStyle w:val="TableGrid"/>
+        <w:tblStyle w:val="Tablaconcuadrcula"/>
         <w:tblW w:w="5424" w:type="pct"/>
         <w:tblInd w:w="-289" w:type="dxa"/>
         <w:tblLook w:val="04A0" w:firstRow="1" w:lastRow="0" w:firstColumn="1" w:lastColumn="0" w:noHBand="0" w:noVBand="1"/>
@@ -3545,7 +3545,7 @@
 </file>
 
 <file path=word/endnotes.xml><?xml version="1.0" encoding="utf-8"?>
-<w:endnotes xmlns:wpc="http://schemas.microsoft.com/office/word/2010/wordprocessingCanvas" xmlns:cx="http://schemas.microsoft.com/office/drawing/2014/chartex" xmlns:cx1="http://schemas.microsoft.com/office/drawing/2015/9/8/chartex" xmlns:cx2="http://schemas.microsoft.com/office/drawing/2015/10/21/chartex" xmlns:cx3="http://schemas.microsoft.com/office/drawing/2016/5/9/chartex" xmlns:cx4="http://schemas.microsoft.com/office/drawing/2016/5/10/chartex" xmlns:cx5="http://schemas.microsoft.com/office/drawing/2016/5/11/chartex" xmlns:cx6="http://schemas.microsoft.com/office/drawing/2016/5/12/chartex" xmlns:cx7="http://schemas.microsoft.com/office/drawing/2016/5/13/chartex" xmlns:cx8="http://schemas.microsoft.com/office/drawing/2016/5/14/chartex" xmlns:mc="http://schemas.openxmlformats.org/markup-compatibility/2006" xmlns:aink="http://schemas.microsoft.com/office/drawing/2016/ink" xmlns:am3d="http://schemas.microsoft.com/office/drawing/2017/model3d" xmlns:o="urn:schemas-microsoft-com:office:office" xmlns:oel="http://schemas.microsoft.com/office/2019/extlst" xmlns:r="http://schemas.openxmlformats.org/officeDocument/2006/relationships" xmlns:m="http://schemas.openxmlformats.org/officeDocument/2006/math" xmlns:v="urn:schemas-microsoft-com:vml" xmlns:wp14="http://schemas.microsoft.com/office/word/2010/wordprocessingDrawing" xmlns:wp="http://schemas.openxmlformats.org/drawingml/2006/wordprocessingDrawing" xmlns:w10="urn:schemas-microsoft-com:office:word" xmlns:w="http://schemas.openxmlformats.org/wordprocessingml/2006/main" xmlns:w14="http://schemas.microsoft.com/office/word/2010/wordml" xmlns:w15="http://schemas.microsoft.com/office/word/2012/wordml" xmlns:w16cex="http://schemas.microsoft.com/office/word/2018/wordml/cex" xmlns:w16cid="http://schemas.microsoft.com/office/word/2016/wordml/cid" xmlns:w16="http://schemas.microsoft.com/office/word/2018/wordml" xmlns:w16du="http://schemas.microsoft.com/office/word/2023/wordml/word16du" xmlns:w16sdtdh="http://schemas.microsoft.com/office/word/2020/wordml/sdtdatahash" xmlns:w16sdtfl="http://schemas.microsoft.com/office/word/2024/wordml/sdtformatlock" xmlns:w16se="http://schemas.microsoft.com/office/word/2015/wordml/symex" xmlns:wpg="http://schemas.microsoft.com/office/word/2010/wordprocessingGroup" xmlns:wpi="http://schemas.microsoft.com/office/word/2010/wordprocessingInk" xmlns:wne="http://schemas.microsoft.com/office/word/2006/wordml" xmlns:wps="http://schemas.microsoft.com/office/word/2010/wordprocessingShape" mc:Ignorable="w14 w15 w16se w16cid w16 w16cex w16sdtdh w16sdtfl w16du wp14">
+<w:endnotes xmlns:wpc="http://schemas.microsoft.com/office/word/2010/wordprocessingCanvas" xmlns:cx="http://schemas.microsoft.com/office/drawing/2014/chartex" xmlns:cx1="http://schemas.microsoft.com/office/drawing/2015/9/8/chartex" xmlns:cx2="http://schemas.microsoft.com/office/drawing/2015/10/21/chartex" xmlns:cx3="http://schemas.microsoft.com/office/drawing/2016/5/9/chartex" xmlns:cx4="http://schemas.microsoft.com/office/drawing/2016/5/10/chartex" xmlns:cx5="http://schemas.microsoft.com/office/drawing/2016/5/11/chartex" xmlns:cx6="http://schemas.microsoft.com/office/drawing/2016/5/12/chartex" xmlns:cx7="http://schemas.microsoft.com/office/drawing/2016/5/13/chartex" xmlns:cx8="http://schemas.microsoft.com/office/drawing/2016/5/14/chartex" xmlns:mc="http://schemas.openxmlformats.org/markup-compatibility/2006" xmlns:aink="http://schemas.microsoft.com/office/drawing/2016/ink" xmlns:am3d="http://schemas.microsoft.com/office/drawing/2017/model3d" xmlns:o="urn:schemas-microsoft-com:office:office" xmlns:oel="http://schemas.microsoft.com/office/2019/extlst" xmlns:r="http://schemas.openxmlformats.org/officeDocument/2006/relationships" xmlns:m="http://schemas.openxmlformats.org/officeDocument/2006/math" xmlns:v="urn:schemas-microsoft-com:vml" xmlns:wp14="http://schemas.microsoft.com/office/word/2010/wordprocessingDrawing" xmlns:wp="http://schemas.openxmlformats.org/drawingml/2006/wordprocessingDrawing" xmlns:w10="urn:schemas-microsoft-com:office:word" xmlns:w="http://schemas.openxmlformats.org/wordprocessingml/2006/main" xmlns:w14="http://schemas.microsoft.com/office/word/2010/wordml" xmlns:w15="http://schemas.microsoft.com/office/word/2012/wordml" xmlns:w16cex="http://schemas.microsoft.com/office/word/2018/wordml/cex" xmlns:w16cid="http://schemas.microsoft.com/office/word/2016/wordml/cid" xmlns:w16="http://schemas.microsoft.com/office/word/2018/wordml" xmlns:w16du="http://schemas.microsoft.com/office/word/2023/wordml/word16du" xmlns:w16sdtdh="http://schemas.microsoft.com/office/word/2020/wordml/sdtdatahash" xmlns:w16se="http://schemas.microsoft.com/office/word/2015/wordml/symex" xmlns:wpg="http://schemas.microsoft.com/office/word/2010/wordprocessingGroup" xmlns:wpi="http://schemas.microsoft.com/office/word/2010/wordprocessingInk" xmlns:wne="http://schemas.microsoft.com/office/word/2006/wordml" xmlns:wps="http://schemas.microsoft.com/office/word/2010/wordprocessingShape" mc:Ignorable="w14 w15 w16se w16cid w16 w16cex w16sdtdh wp14">
   <w:endnote w:type="separator" w:id="-1">
     <w:p>
       <w:r>
@@ -3564,7 +3564,7 @@
 </file>
 
 <file path=word/footnotes.xml><?xml version="1.0" encoding="utf-8"?>
-<w:footnotes xmlns:wpc="http://schemas.microsoft.com/office/word/2010/wordprocessingCanvas" xmlns:cx="http://schemas.microsoft.com/office/drawing/2014/chartex" xmlns:cx1="http://schemas.microsoft.com/office/drawing/2015/9/8/chartex" xmlns:cx2="http://schemas.microsoft.com/office/drawing/2015/10/21/chartex" xmlns:cx3="http://schemas.microsoft.com/office/drawing/2016/5/9/chartex" xmlns:cx4="http://schemas.microsoft.com/office/drawing/2016/5/10/chartex" xmlns:cx5="http://schemas.microsoft.com/office/drawing/2016/5/11/chartex" xmlns:cx6="http://schemas.microsoft.com/office/drawing/2016/5/12/chartex" xmlns:cx7="http://schemas.microsoft.com/office/drawing/2016/5/13/chartex" xmlns:cx8="http://schemas.microsoft.com/office/drawing/2016/5/14/chartex" xmlns:mc="http://schemas.openxmlformats.org/markup-compatibility/2006" xmlns:aink="http://schemas.microsoft.com/office/drawing/2016/ink" xmlns:am3d="http://schemas.microsoft.com/office/drawing/2017/model3d" xmlns:o="urn:schemas-microsoft-com:office:office" xmlns:oel="http://schemas.microsoft.com/office/2019/extlst" xmlns:r="http://schemas.openxmlformats.org/officeDocument/2006/relationships" xmlns:m="http://schemas.openxmlformats.org/officeDocument/2006/math" xmlns:v="urn:schemas-microsoft-com:vml" xmlns:wp14="http://schemas.microsoft.com/office/word/2010/wordprocessingDrawing" xmlns:wp="http://schemas.openxmlformats.org/drawingml/2006/wordprocessingDrawing" xmlns:w10="urn:schemas-microsoft-com:office:word" xmlns:w="http://schemas.openxmlformats.org/wordprocessingml/2006/main" xmlns:w14="http://schemas.microsoft.com/office/word/2010/wordml" xmlns:w15="http://schemas.microsoft.com/office/word/2012/wordml" xmlns:w16cex="http://schemas.microsoft.com/office/word/2018/wordml/cex" xmlns:w16cid="http://schemas.microsoft.com/office/word/2016/wordml/cid" xmlns:w16="http://schemas.microsoft.com/office/word/2018/wordml" xmlns:w16du="http://schemas.microsoft.com/office/word/2023/wordml/word16du" xmlns:w16sdtdh="http://schemas.microsoft.com/office/word/2020/wordml/sdtdatahash" xmlns:w16sdtfl="http://schemas.microsoft.com/office/word/2024/wordml/sdtformatlock" xmlns:w16se="http://schemas.microsoft.com/office/word/2015/wordml/symex" xmlns:wpg="http://schemas.microsoft.com/office/word/2010/wordprocessingGroup" xmlns:wpi="http://schemas.microsoft.com/office/word/2010/wordprocessingInk" xmlns:wne="http://schemas.microsoft.com/office/word/2006/wordml" xmlns:wps="http://schemas.microsoft.com/office/word/2010/wordprocessingShape" mc:Ignorable="w14 w15 w16se w16cid w16 w16cex w16sdtdh w16sdtfl w16du wp14">
+<w:footnotes xmlns:wpc="http://schemas.microsoft.com/office/word/2010/wordprocessingCanvas" xmlns:cx="http://schemas.microsoft.com/office/drawing/2014/chartex" xmlns:cx1="http://schemas.microsoft.com/office/drawing/2015/9/8/chartex" xmlns:cx2="http://schemas.microsoft.com/office/drawing/2015/10/21/chartex" xmlns:cx3="http://schemas.microsoft.com/office/drawing/2016/5/9/chartex" xmlns:cx4="http://schemas.microsoft.com/office/drawing/2016/5/10/chartex" xmlns:cx5="http://schemas.microsoft.com/office/drawing/2016/5/11/chartex" xmlns:cx6="http://schemas.microsoft.com/office/drawing/2016/5/12/chartex" xmlns:cx7="http://schemas.microsoft.com/office/drawing/2016/5/13/chartex" xmlns:cx8="http://schemas.microsoft.com/office/drawing/2016/5/14/chartex" xmlns:mc="http://schemas.openxmlformats.org/markup-compatibility/2006" xmlns:aink="http://schemas.microsoft.com/office/drawing/2016/ink" xmlns:am3d="http://schemas.microsoft.com/office/drawing/2017/model3d" xmlns:o="urn:schemas-microsoft-com:office:office" xmlns:oel="http://schemas.microsoft.com/office/2019/extlst" xmlns:r="http://schemas.openxmlformats.org/officeDocument/2006/relationships" xmlns:m="http://schemas.openxmlformats.org/officeDocument/2006/math" xmlns:v="urn:schemas-microsoft-com:vml" xmlns:wp14="http://schemas.microsoft.com/office/word/2010/wordprocessingDrawing" xmlns:wp="http://schemas.openxmlformats.org/drawingml/2006/wordprocessingDrawing" xmlns:w10="urn:schemas-microsoft-com:office:word" xmlns:w="http://schemas.openxmlformats.org/wordprocessingml/2006/main" xmlns:w14="http://schemas.microsoft.com/office/word/2010/wordml" xmlns:w15="http://schemas.microsoft.com/office/word/2012/wordml" xmlns:w16cex="http://schemas.microsoft.com/office/word/2018/wordml/cex" xmlns:w16cid="http://schemas.microsoft.com/office/word/2016/wordml/cid" xmlns:w16="http://schemas.microsoft.com/office/word/2018/wordml" xmlns:w16du="http://schemas.microsoft.com/office/word/2023/wordml/word16du" xmlns:w16sdtdh="http://schemas.microsoft.com/office/word/2020/wordml/sdtdatahash" xmlns:w16se="http://schemas.microsoft.com/office/word/2015/wordml/symex" xmlns:wpg="http://schemas.microsoft.com/office/word/2010/wordprocessingGroup" xmlns:wpi="http://schemas.microsoft.com/office/word/2010/wordprocessingInk" xmlns:wne="http://schemas.microsoft.com/office/word/2006/wordml" xmlns:wps="http://schemas.microsoft.com/office/word/2010/wordprocessingShape" mc:Ignorable="w14 w15 w16se w16cid w16 w16cex w16sdtdh wp14">
   <w:footnote w:type="separator" w:id="-1">
     <w:p>
       <w:r>
@@ -3583,10 +3583,10 @@
 </file>
 
 <file path=word/header1.xml><?xml version="1.0" encoding="utf-8"?>
-<w:hdr xmlns:wpc="http://schemas.microsoft.com/office/word/2010/wordprocessingCanvas" xmlns:cx="http://schemas.microsoft.com/office/drawing/2014/chartex" xmlns:cx1="http://schemas.microsoft.com/office/drawing/2015/9/8/chartex" xmlns:cx2="http://schemas.microsoft.com/office/drawing/2015/10/21/chartex" xmlns:cx3="http://schemas.microsoft.com/office/drawing/2016/5/9/chartex" xmlns:cx4="http://schemas.microsoft.com/office/drawing/2016/5/10/chartex" xmlns:cx5="http://schemas.microsoft.com/office/drawing/2016/5/11/chartex" xmlns:cx6="http://schemas.microsoft.com/office/drawing/2016/5/12/chartex" xmlns:cx7="http://schemas.microsoft.com/office/drawing/2016/5/13/chartex" xmlns:cx8="http://schemas.microsoft.com/office/drawing/2016/5/14/chartex" xmlns:mc="http://schemas.openxmlformats.org/markup-compatibility/2006" xmlns:aink="http://schemas.microsoft.com/office/drawing/2016/ink" xmlns:am3d="http://schemas.microsoft.com/office/drawing/2017/model3d" xmlns:o="urn:schemas-microsoft-com:office:office" xmlns:oel="http://schemas.microsoft.com/office/2019/extlst" xmlns:r="http://schemas.openxmlformats.org/officeDocument/2006/relationships" xmlns:m="http://schemas.openxmlformats.org/officeDocument/2006/math" xmlns:v="urn:schemas-microsoft-com:vml" xmlns:wp14="http://schemas.microsoft.com/office/word/2010/wordprocessingDrawing" xmlns:wp="http://schemas.openxmlformats.org/drawingml/2006/wordprocessingDrawing" xmlns:w10="urn:schemas-microsoft-com:office:word" xmlns:w="http://schemas.openxmlformats.org/wordprocessingml/2006/main" xmlns:w14="http://schemas.microsoft.com/office/word/2010/wordml" xmlns:w15="http://schemas.microsoft.com/office/word/2012/wordml" xmlns:w16cex="http://schemas.microsoft.com/office/word/2018/wordml/cex" xmlns:w16cid="http://schemas.microsoft.com/office/word/2016/wordml/cid" xmlns:w16="http://schemas.microsoft.com/office/word/2018/wordml" xmlns:w16du="http://schemas.microsoft.com/office/word/2023/wordml/word16du" xmlns:w16sdtdh="http://schemas.microsoft.com/office/word/2020/wordml/sdtdatahash" xmlns:w16sdtfl="http://schemas.microsoft.com/office/word/2024/wordml/sdtformatlock" xmlns:w16se="http://schemas.microsoft.com/office/word/2015/wordml/symex" xmlns:wpg="http://schemas.microsoft.com/office/word/2010/wordprocessingGroup" xmlns:wpi="http://schemas.microsoft.com/office/word/2010/wordprocessingInk" xmlns:wne="http://schemas.microsoft.com/office/word/2006/wordml" xmlns:wps="http://schemas.microsoft.com/office/word/2010/wordprocessingShape" mc:Ignorable="w14 w15 w16se w16cid w16 w16cex w16sdtdh w16sdtfl w16du wp14">
+<w:hdr xmlns:wpc="http://schemas.microsoft.com/office/word/2010/wordprocessingCanvas" xmlns:cx="http://schemas.microsoft.com/office/drawing/2014/chartex" xmlns:cx1="http://schemas.microsoft.com/office/drawing/2015/9/8/chartex" xmlns:cx2="http://schemas.microsoft.com/office/drawing/2015/10/21/chartex" xmlns:cx3="http://schemas.microsoft.com/office/drawing/2016/5/9/chartex" xmlns:cx4="http://schemas.microsoft.com/office/drawing/2016/5/10/chartex" xmlns:cx5="http://schemas.microsoft.com/office/drawing/2016/5/11/chartex" xmlns:cx6="http://schemas.microsoft.com/office/drawing/2016/5/12/chartex" xmlns:cx7="http://schemas.microsoft.com/office/drawing/2016/5/13/chartex" xmlns:cx8="http://schemas.microsoft.com/office/drawing/2016/5/14/chartex" xmlns:mc="http://schemas.openxmlformats.org/markup-compatibility/2006" xmlns:aink="http://schemas.microsoft.com/office/drawing/2016/ink" xmlns:am3d="http://schemas.microsoft.com/office/drawing/2017/model3d" xmlns:o="urn:schemas-microsoft-com:office:office" xmlns:oel="http://schemas.microsoft.com/office/2019/extlst" xmlns:r="http://schemas.openxmlformats.org/officeDocument/2006/relationships" xmlns:m="http://schemas.openxmlformats.org/officeDocument/2006/math" xmlns:v="urn:schemas-microsoft-com:vml" xmlns:wp14="http://schemas.microsoft.com/office/word/2010/wordprocessingDrawing" xmlns:wp="http://schemas.openxmlformats.org/drawingml/2006/wordprocessingDrawing" xmlns:w10="urn:schemas-microsoft-com:office:word" xmlns:w="http://schemas.openxmlformats.org/wordprocessingml/2006/main" xmlns:w14="http://schemas.microsoft.com/office/word/2010/wordml" xmlns:w15="http://schemas.microsoft.com/office/word/2012/wordml" xmlns:w16cex="http://schemas.microsoft.com/office/word/2018/wordml/cex" xmlns:w16cid="http://schemas.microsoft.com/office/word/2016/wordml/cid" xmlns:w16="http://schemas.microsoft.com/office/word/2018/wordml" xmlns:w16du="http://schemas.microsoft.com/office/word/2023/wordml/word16du" xmlns:w16sdtdh="http://schemas.microsoft.com/office/word/2020/wordml/sdtdatahash" xmlns:w16se="http://schemas.microsoft.com/office/word/2015/wordml/symex" xmlns:wpg="http://schemas.microsoft.com/office/word/2010/wordprocessingGroup" xmlns:wpi="http://schemas.microsoft.com/office/word/2010/wordprocessingInk" xmlns:wne="http://schemas.microsoft.com/office/word/2006/wordml" xmlns:wps="http://schemas.microsoft.com/office/word/2010/wordprocessingShape" mc:Ignorable="w14 w15 w16se w16cid w16 w16cex w16sdtdh wp14">
   <w:p>
     <w:pPr>
-      <w:pStyle w:val="Header"/>
+      <w:pStyle w:val="Encabezado"/>
     </w:pPr>
     <w:r>
       <w:rPr>
@@ -3623,10 +3623,10 @@
 </file>
 
 <file path=word/header2.xml><?xml version="1.0" encoding="utf-8"?>
-<w:hdr xmlns:wpc="http://schemas.microsoft.com/office/word/2010/wordprocessingCanvas" xmlns:cx="http://schemas.microsoft.com/office/drawing/2014/chartex" xmlns:cx1="http://schemas.microsoft.com/office/drawing/2015/9/8/chartex" xmlns:cx2="http://schemas.microsoft.com/office/drawing/2015/10/21/chartex" xmlns:cx3="http://schemas.microsoft.com/office/drawing/2016/5/9/chartex" xmlns:cx4="http://schemas.microsoft.com/office/drawing/2016/5/10/chartex" xmlns:cx5="http://schemas.microsoft.com/office/drawing/2016/5/11/chartex" xmlns:cx6="http://schemas.microsoft.com/office/drawing/2016/5/12/chartex" xmlns:cx7="http://schemas.microsoft.com/office/drawing/2016/5/13/chartex" xmlns:cx8="http://schemas.microsoft.com/office/drawing/2016/5/14/chartex" xmlns:mc="http://schemas.openxmlformats.org/markup-compatibility/2006" xmlns:aink="http://schemas.microsoft.com/office/drawing/2016/ink" xmlns:am3d="http://schemas.microsoft.com/office/drawing/2017/model3d" xmlns:o="urn:schemas-microsoft-com:office:office" xmlns:oel="http://schemas.microsoft.com/office/2019/extlst" xmlns:r="http://schemas.openxmlformats.org/officeDocument/2006/relationships" xmlns:m="http://schemas.openxmlformats.org/officeDocument/2006/math" xmlns:v="urn:schemas-microsoft-com:vml" xmlns:wp14="http://schemas.microsoft.com/office/word/2010/wordprocessingDrawing" xmlns:wp="http://schemas.openxmlformats.org/drawingml/2006/wordprocessingDrawing" xmlns:w10="urn:schemas-microsoft-com:office:word" xmlns:w="http://schemas.openxmlformats.org/wordprocessingml/2006/main" xmlns:w14="http://schemas.microsoft.com/office/word/2010/wordml" xmlns:w15="http://schemas.microsoft.com/office/word/2012/wordml" xmlns:w16cex="http://schemas.microsoft.com/office/word/2018/wordml/cex" xmlns:w16cid="http://schemas.microsoft.com/office/word/2016/wordml/cid" xmlns:w16="http://schemas.microsoft.com/office/word/2018/wordml" xmlns:w16du="http://schemas.microsoft.com/office/word/2023/wordml/word16du" xmlns:w16sdtdh="http://schemas.microsoft.com/office/word/2020/wordml/sdtdatahash" xmlns:w16sdtfl="http://schemas.microsoft.com/office/word/2024/wordml/sdtformatlock" xmlns:w16se="http://schemas.microsoft.com/office/word/2015/wordml/symex" xmlns:wpg="http://schemas.microsoft.com/office/word/2010/wordprocessingGroup" xmlns:wpi="http://schemas.microsoft.com/office/word/2010/wordprocessingInk" xmlns:wne="http://schemas.microsoft.com/office/word/2006/wordml" xmlns:wps="http://schemas.microsoft.com/office/word/2010/wordprocessingShape" mc:Ignorable="w14 w15 w16se w16cid w16 w16cex w16sdtdh w16sdtfl w16du wp14">
+<w:hdr xmlns:wpc="http://schemas.microsoft.com/office/word/2010/wordprocessingCanvas" xmlns:cx="http://schemas.microsoft.com/office/drawing/2014/chartex" xmlns:cx1="http://schemas.microsoft.com/office/drawing/2015/9/8/chartex" xmlns:cx2="http://schemas.microsoft.com/office/drawing/2015/10/21/chartex" xmlns:cx3="http://schemas.microsoft.com/office/drawing/2016/5/9/chartex" xmlns:cx4="http://schemas.microsoft.com/office/drawing/2016/5/10/chartex" xmlns:cx5="http://schemas.microsoft.com/office/drawing/2016/5/11/chartex" xmlns:cx6="http://schemas.microsoft.com/office/drawing/2016/5/12/chartex" xmlns:cx7="http://schemas.microsoft.com/office/drawing/2016/5/13/chartex" xmlns:cx8="http://schemas.microsoft.com/office/drawing/2016/5/14/chartex" xmlns:mc="http://schemas.openxmlformats.org/markup-compatibility/2006" xmlns:aink="http://schemas.microsoft.com/office/drawing/2016/ink" xmlns:am3d="http://schemas.microsoft.com/office/drawing/2017/model3d" xmlns:o="urn:schemas-microsoft-com:office:office" xmlns:oel="http://schemas.microsoft.com/office/2019/extlst" xmlns:r="http://schemas.openxmlformats.org/officeDocument/2006/relationships" xmlns:m="http://schemas.openxmlformats.org/officeDocument/2006/math" xmlns:v="urn:schemas-microsoft-com:vml" xmlns:wp14="http://schemas.microsoft.com/office/word/2010/wordprocessingDrawing" xmlns:wp="http://schemas.openxmlformats.org/drawingml/2006/wordprocessingDrawing" xmlns:w10="urn:schemas-microsoft-com:office:word" xmlns:w="http://schemas.openxmlformats.org/wordprocessingml/2006/main" xmlns:w14="http://schemas.microsoft.com/office/word/2010/wordml" xmlns:w15="http://schemas.microsoft.com/office/word/2012/wordml" xmlns:w16cex="http://schemas.microsoft.com/office/word/2018/wordml/cex" xmlns:w16cid="http://schemas.microsoft.com/office/word/2016/wordml/cid" xmlns:w16="http://schemas.microsoft.com/office/word/2018/wordml" xmlns:w16du="http://schemas.microsoft.com/office/word/2023/wordml/word16du" xmlns:w16sdtdh="http://schemas.microsoft.com/office/word/2020/wordml/sdtdatahash" xmlns:w16se="http://schemas.microsoft.com/office/word/2015/wordml/symex" xmlns:wpg="http://schemas.microsoft.com/office/word/2010/wordprocessingGroup" xmlns:wpi="http://schemas.microsoft.com/office/word/2010/wordprocessingInk" xmlns:wne="http://schemas.microsoft.com/office/word/2006/wordml" xmlns:wps="http://schemas.microsoft.com/office/word/2010/wordprocessingShape" mc:Ignorable="w14 w15 w16se w16cid w16 w16cex w16sdtdh wp14">
   <w:p>
     <w:pPr>
-      <w:pStyle w:val="Header"/>
+      <w:pStyle w:val="Encabezado"/>
     </w:pPr>
     <w:r>
       <w:rPr>
@@ -3663,10 +3663,10 @@
 </file>
 
 <file path=word/header3.xml><?xml version="1.0" encoding="utf-8"?>
-<w:hdr xmlns:wpc="http://schemas.microsoft.com/office/word/2010/wordprocessingCanvas" xmlns:cx="http://schemas.microsoft.com/office/drawing/2014/chartex" xmlns:cx1="http://schemas.microsoft.com/office/drawing/2015/9/8/chartex" xmlns:cx2="http://schemas.microsoft.com/office/drawing/2015/10/21/chartex" xmlns:cx3="http://schemas.microsoft.com/office/drawing/2016/5/9/chartex" xmlns:cx4="http://schemas.microsoft.com/office/drawing/2016/5/10/chartex" xmlns:cx5="http://schemas.microsoft.com/office/drawing/2016/5/11/chartex" xmlns:cx6="http://schemas.microsoft.com/office/drawing/2016/5/12/chartex" xmlns:cx7="http://schemas.microsoft.com/office/drawing/2016/5/13/chartex" xmlns:cx8="http://schemas.microsoft.com/office/drawing/2016/5/14/chartex" xmlns:mc="http://schemas.openxmlformats.org/markup-compatibility/2006" xmlns:aink="http://schemas.microsoft.com/office/drawing/2016/ink" xmlns:am3d="http://schemas.microsoft.com/office/drawing/2017/model3d" xmlns:o="urn:schemas-microsoft-com:office:office" xmlns:oel="http://schemas.microsoft.com/office/2019/extlst" xmlns:r="http://schemas.openxmlformats.org/officeDocument/2006/relationships" xmlns:m="http://schemas.openxmlformats.org/officeDocument/2006/math" xmlns:v="urn:schemas-microsoft-com:vml" xmlns:wp14="http://schemas.microsoft.com/office/word/2010/wordprocessingDrawing" xmlns:wp="http://schemas.openxmlformats.org/drawingml/2006/wordprocessingDrawing" xmlns:w10="urn:schemas-microsoft-com:office:word" xmlns:w="http://schemas.openxmlformats.org/wordprocessingml/2006/main" xmlns:w14="http://schemas.microsoft.com/office/word/2010/wordml" xmlns:w15="http://schemas.microsoft.com/office/word/2012/wordml" xmlns:w16cex="http://schemas.microsoft.com/office/word/2018/wordml/cex" xmlns:w16cid="http://schemas.microsoft.com/office/word/2016/wordml/cid" xmlns:w16="http://schemas.microsoft.com/office/word/2018/wordml" xmlns:w16du="http://schemas.microsoft.com/office/word/2023/wordml/word16du" xmlns:w16sdtdh="http://schemas.microsoft.com/office/word/2020/wordml/sdtdatahash" xmlns:w16sdtfl="http://schemas.microsoft.com/office/word/2024/wordml/sdtformatlock" xmlns:w16se="http://schemas.microsoft.com/office/word/2015/wordml/symex" xmlns:wpg="http://schemas.microsoft.com/office/word/2010/wordprocessingGroup" xmlns:wpi="http://schemas.microsoft.com/office/word/2010/wordprocessingInk" xmlns:wne="http://schemas.microsoft.com/office/word/2006/wordml" xmlns:wps="http://schemas.microsoft.com/office/word/2010/wordprocessingShape" mc:Ignorable="w14 w15 w16se w16cid w16 w16cex w16sdtdh w16sdtfl w16du wp14">
+<w:hdr xmlns:wpc="http://schemas.microsoft.com/office/word/2010/wordprocessingCanvas" xmlns:cx="http://schemas.microsoft.com/office/drawing/2014/chartex" xmlns:cx1="http://schemas.microsoft.com/office/drawing/2015/9/8/chartex" xmlns:cx2="http://schemas.microsoft.com/office/drawing/2015/10/21/chartex" xmlns:cx3="http://schemas.microsoft.com/office/drawing/2016/5/9/chartex" xmlns:cx4="http://schemas.microsoft.com/office/drawing/2016/5/10/chartex" xmlns:cx5="http://schemas.microsoft.com/office/drawing/2016/5/11/chartex" xmlns:cx6="http://schemas.microsoft.com/office/drawing/2016/5/12/chartex" xmlns:cx7="http://schemas.microsoft.com/office/drawing/2016/5/13/chartex" xmlns:cx8="http://schemas.microsoft.com/office/drawing/2016/5/14/chartex" xmlns:mc="http://schemas.openxmlformats.org/markup-compatibility/2006" xmlns:aink="http://schemas.microsoft.com/office/drawing/2016/ink" xmlns:am3d="http://schemas.microsoft.com/office/drawing/2017/model3d" xmlns:o="urn:schemas-microsoft-com:office:office" xmlns:oel="http://schemas.microsoft.com/office/2019/extlst" xmlns:r="http://schemas.openxmlformats.org/officeDocument/2006/relationships" xmlns:m="http://schemas.openxmlformats.org/officeDocument/2006/math" xmlns:v="urn:schemas-microsoft-com:vml" xmlns:wp14="http://schemas.microsoft.com/office/word/2010/wordprocessingDrawing" xmlns:wp="http://schemas.openxmlformats.org/drawingml/2006/wordprocessingDrawing" xmlns:w10="urn:schemas-microsoft-com:office:word" xmlns:w="http://schemas.openxmlformats.org/wordprocessingml/2006/main" xmlns:w14="http://schemas.microsoft.com/office/word/2010/wordml" xmlns:w15="http://schemas.microsoft.com/office/word/2012/wordml" xmlns:w16cex="http://schemas.microsoft.com/office/word/2018/wordml/cex" xmlns:w16cid="http://schemas.microsoft.com/office/word/2016/wordml/cid" xmlns:w16="http://schemas.microsoft.com/office/word/2018/wordml" xmlns:w16du="http://schemas.microsoft.com/office/word/2023/wordml/word16du" xmlns:w16sdtdh="http://schemas.microsoft.com/office/word/2020/wordml/sdtdatahash" xmlns:w16se="http://schemas.microsoft.com/office/word/2015/wordml/symex" xmlns:wpg="http://schemas.microsoft.com/office/word/2010/wordprocessingGroup" xmlns:wpi="http://schemas.microsoft.com/office/word/2010/wordprocessingInk" xmlns:wne="http://schemas.microsoft.com/office/word/2006/wordml" xmlns:wps="http://schemas.microsoft.com/office/word/2010/wordprocessingShape" mc:Ignorable="w14 w15 w16se w16cid w16 w16cex w16sdtdh wp14">
   <w:p>
     <w:pPr>
-      <w:pStyle w:val="Header"/>
+      <w:pStyle w:val="Encabezado"/>
     </w:pPr>
     <w:r>
       <w:rPr>
@@ -3703,7 +3703,7 @@
 </file>
 
 <file path=word/numbering.xml><?xml version="1.0" encoding="utf-8"?>
-<w:numbering xmlns:wpc="http://schemas.microsoft.com/office/word/2010/wordprocessingCanvas" xmlns:cx="http://schemas.microsoft.com/office/drawing/2014/chartex" xmlns:cx1="http://schemas.microsoft.com/office/drawing/2015/9/8/chartex" xmlns:cx2="http://schemas.microsoft.com/office/drawing/2015/10/21/chartex" xmlns:cx3="http://schemas.microsoft.com/office/drawing/2016/5/9/chartex" xmlns:cx4="http://schemas.microsoft.com/office/drawing/2016/5/10/chartex" xmlns:cx5="http://schemas.microsoft.com/office/drawing/2016/5/11/chartex" xmlns:cx6="http://schemas.microsoft.com/office/drawing/2016/5/12/chartex" xmlns:cx7="http://schemas.microsoft.com/office/drawing/2016/5/13/chartex" xmlns:cx8="http://schemas.microsoft.com/office/drawing/2016/5/14/chartex" xmlns:mc="http://schemas.openxmlformats.org/markup-compatibility/2006" xmlns:aink="http://schemas.microsoft.com/office/drawing/2016/ink" xmlns:am3d="http://schemas.microsoft.com/office/drawing/2017/model3d" xmlns:o="urn:schemas-microsoft-com:office:office" xmlns:oel="http://schemas.microsoft.com/office/2019/extlst" xmlns:r="http://schemas.openxmlformats.org/officeDocument/2006/relationships" xmlns:m="http://schemas.openxmlformats.org/officeDocument/2006/math" xmlns:v="urn:schemas-microsoft-com:vml" xmlns:wp14="http://schemas.microsoft.com/office/word/2010/wordprocessingDrawing" xmlns:wp="http://schemas.openxmlformats.org/drawingml/2006/wordprocessingDrawing" xmlns:w10="urn:schemas-microsoft-com:office:word" xmlns:w="http://schemas.openxmlformats.org/wordprocessingml/2006/main" xmlns:w14="http://schemas.microsoft.com/office/word/2010/wordml" xmlns:w15="http://schemas.microsoft.com/office/word/2012/wordml" xmlns:w16cex="http://schemas.microsoft.com/office/word/2018/wordml/cex" xmlns:w16cid="http://schemas.microsoft.com/office/word/2016/wordml/cid" xmlns:w16="http://schemas.microsoft.com/office/word/2018/wordml" xmlns:w16du="http://schemas.microsoft.com/office/word/2023/wordml/word16du" xmlns:w16sdtdh="http://schemas.microsoft.com/office/word/2020/wordml/sdtdatahash" xmlns:w16sdtfl="http://schemas.microsoft.com/office/word/2024/wordml/sdtformatlock" xmlns:w16se="http://schemas.microsoft.com/office/word/2015/wordml/symex" xmlns:wpg="http://schemas.microsoft.com/office/word/2010/wordprocessingGroup" xmlns:wpi="http://schemas.microsoft.com/office/word/2010/wordprocessingInk" xmlns:wne="http://schemas.microsoft.com/office/word/2006/wordml" xmlns:wps="http://schemas.microsoft.com/office/word/2010/wordprocessingShape" mc:Ignorable="w14 w15 w16se w16cid w16 w16cex w16sdtdh w16sdtfl w16du wp14">
+<w:numbering xmlns:wpc="http://schemas.microsoft.com/office/word/2010/wordprocessingCanvas" xmlns:cx="http://schemas.microsoft.com/office/drawing/2014/chartex" xmlns:cx1="http://schemas.microsoft.com/office/drawing/2015/9/8/chartex" xmlns:cx2="http://schemas.microsoft.com/office/drawing/2015/10/21/chartex" xmlns:cx3="http://schemas.microsoft.com/office/drawing/2016/5/9/chartex" xmlns:cx4="http://schemas.microsoft.com/office/drawing/2016/5/10/chartex" xmlns:cx5="http://schemas.microsoft.com/office/drawing/2016/5/11/chartex" xmlns:cx6="http://schemas.microsoft.com/office/drawing/2016/5/12/chartex" xmlns:cx7="http://schemas.microsoft.com/office/drawing/2016/5/13/chartex" xmlns:cx8="http://schemas.microsoft.com/office/drawing/2016/5/14/chartex" xmlns:mc="http://schemas.openxmlformats.org/markup-compatibility/2006" xmlns:aink="http://schemas.microsoft.com/office/drawing/2016/ink" xmlns:am3d="http://schemas.microsoft.com/office/drawing/2017/model3d" xmlns:o="urn:schemas-microsoft-com:office:office" xmlns:oel="http://schemas.microsoft.com/office/2019/extlst" xmlns:r="http://schemas.openxmlformats.org/officeDocument/2006/relationships" xmlns:m="http://schemas.openxmlformats.org/officeDocument/2006/math" xmlns:v="urn:schemas-microsoft-com:vml" xmlns:wp14="http://schemas.microsoft.com/office/word/2010/wordprocessingDrawing" xmlns:wp="http://schemas.openxmlformats.org/drawingml/2006/wordprocessingDrawing" xmlns:w10="urn:schemas-microsoft-com:office:word" xmlns:w="http://schemas.openxmlformats.org/wordprocessingml/2006/main" xmlns:w14="http://schemas.microsoft.com/office/word/2010/wordml" xmlns:w15="http://schemas.microsoft.com/office/word/2012/wordml" xmlns:w16cex="http://schemas.microsoft.com/office/word/2018/wordml/cex" xmlns:w16cid="http://schemas.microsoft.com/office/word/2016/wordml/cid" xmlns:w16="http://schemas.microsoft.com/office/word/2018/wordml" xmlns:w16du="http://schemas.microsoft.com/office/word/2023/wordml/word16du" xmlns:w16sdtdh="http://schemas.microsoft.com/office/word/2020/wordml/sdtdatahash" xmlns:w16se="http://schemas.microsoft.com/office/word/2015/wordml/symex" xmlns:wpg="http://schemas.microsoft.com/office/word/2010/wordprocessingGroup" xmlns:wpi="http://schemas.microsoft.com/office/word/2010/wordprocessingInk" xmlns:wne="http://schemas.microsoft.com/office/word/2006/wordml" xmlns:wps="http://schemas.microsoft.com/office/word/2010/wordprocessingShape" mc:Ignorable="w14 w15 w16se w16cid w16 w16cex w16sdtdh wp14">
   <w:abstractNum w:abstractNumId="0" w15:restartNumberingAfterBreak="0">
     <w:nsid w:val="0B9D3011"/>
     <w:multiLevelType w:val="hybridMultilevel"/>
@@ -4284,7 +4284,7 @@
 </file>
 
 <file path=word/styles.xml><?xml version="1.0" encoding="utf-8"?>
-<w:styles xmlns:mc="http://schemas.openxmlformats.org/markup-compatibility/2006" xmlns:r="http://schemas.openxmlformats.org/officeDocument/2006/relationships" xmlns:w="http://schemas.openxmlformats.org/wordprocessingml/2006/main" xmlns:w14="http://schemas.microsoft.com/office/word/2010/wordml" xmlns:w15="http://schemas.microsoft.com/office/word/2012/wordml" xmlns:w16cex="http://schemas.microsoft.com/office/word/2018/wordml/cex" xmlns:w16cid="http://schemas.microsoft.com/office/word/2016/wordml/cid" xmlns:w16="http://schemas.microsoft.com/office/word/2018/wordml" xmlns:w16du="http://schemas.microsoft.com/office/word/2023/wordml/word16du" xmlns:w16sdtdh="http://schemas.microsoft.com/office/word/2020/wordml/sdtdatahash" xmlns:w16sdtfl="http://schemas.microsoft.com/office/word/2024/wordml/sdtformatlock" xmlns:w16se="http://schemas.microsoft.com/office/word/2015/wordml/symex" mc:Ignorable="w14 w15 w16se w16cid w16 w16cex w16sdtdh w16sdtfl w16du">
+<w:styles xmlns:mc="http://schemas.openxmlformats.org/markup-compatibility/2006" xmlns:r="http://schemas.openxmlformats.org/officeDocument/2006/relationships" xmlns:w="http://schemas.openxmlformats.org/wordprocessingml/2006/main" xmlns:w14="http://schemas.microsoft.com/office/word/2010/wordml" xmlns:w15="http://schemas.microsoft.com/office/word/2012/wordml" xmlns:w16cex="http://schemas.microsoft.com/office/word/2018/wordml/cex" xmlns:w16cid="http://schemas.microsoft.com/office/word/2016/wordml/cid" xmlns:w16="http://schemas.microsoft.com/office/word/2018/wordml" xmlns:w16sdtdh="http://schemas.microsoft.com/office/word/2020/wordml/sdtdatahash" xmlns:w16se="http://schemas.microsoft.com/office/word/2015/wordml/symex" mc:Ignorable="w14 w15 w16se w16cid w16 w16cex w16sdtdh">
   <w:docDefaults>
     <w:rPrDefault>
       <w:rPr>
@@ -4692,13 +4692,13 @@
       <w:lang w:eastAsia="es-ES"/>
     </w:rPr>
   </w:style>
-  <w:style w:type="character" w:default="1" w:styleId="DefaultParagraphFont">
+  <w:style w:type="character" w:default="1" w:styleId="Fuentedeprrafopredeter">
     <w:name w:val="Default Paragraph Font"/>
     <w:uiPriority w:val="1"/>
     <w:semiHidden/>
     <w:unhideWhenUsed/>
   </w:style>
-  <w:style w:type="table" w:default="1" w:styleId="TableNormal">
+  <w:style w:type="table" w:default="1" w:styleId="Tablanormal">
     <w:name w:val="Normal Table"/>
     <w:uiPriority w:val="99"/>
     <w:semiHidden/>
@@ -4713,16 +4713,16 @@
       </w:tblCellMar>
     </w:tblPr>
   </w:style>
-  <w:style w:type="numbering" w:default="1" w:styleId="NoList">
+  <w:style w:type="numbering" w:default="1" w:styleId="Sinlista">
     <w:name w:val="No List"/>
     <w:uiPriority w:val="99"/>
     <w:semiHidden/>
     <w:unhideWhenUsed/>
   </w:style>
-  <w:style w:type="paragraph" w:styleId="Header">
+  <w:style w:type="paragraph" w:styleId="Encabezado">
     <w:name w:val="header"/>
     <w:basedOn w:val="Normal"/>
-    <w:link w:val="HeaderChar"/>
+    <w:link w:val="EncabezadoCar"/>
     <w:uiPriority w:val="99"/>
     <w:unhideWhenUsed/>
     <w:rsid w:val="004C51BE"/>
@@ -4739,17 +4739,17 @@
       <w:lang w:eastAsia="en-US"/>
     </w:rPr>
   </w:style>
-  <w:style w:type="character" w:customStyle="1" w:styleId="HeaderChar">
-    <w:name w:val="Header Char"/>
-    <w:basedOn w:val="DefaultParagraphFont"/>
-    <w:link w:val="Header"/>
+  <w:style w:type="character" w:customStyle="1" w:styleId="EncabezadoCar">
+    <w:name w:val="Encabezado Car"/>
+    <w:basedOn w:val="Fuentedeprrafopredeter"/>
+    <w:link w:val="Encabezado"/>
     <w:uiPriority w:val="99"/>
     <w:rsid w:val="004C51BE"/>
   </w:style>
-  <w:style w:type="paragraph" w:styleId="Footer">
+  <w:style w:type="paragraph" w:styleId="Piedepgina">
     <w:name w:val="footer"/>
     <w:basedOn w:val="Normal"/>
-    <w:link w:val="FooterChar"/>
+    <w:link w:val="PiedepginaCar"/>
     <w:uiPriority w:val="99"/>
     <w:unhideWhenUsed/>
     <w:rsid w:val="004C51BE"/>
@@ -4766,16 +4766,16 @@
       <w:lang w:eastAsia="en-US"/>
     </w:rPr>
   </w:style>
-  <w:style w:type="character" w:customStyle="1" w:styleId="FooterChar">
-    <w:name w:val="Footer Char"/>
-    <w:basedOn w:val="DefaultParagraphFont"/>
-    <w:link w:val="Footer"/>
+  <w:style w:type="character" w:customStyle="1" w:styleId="PiedepginaCar">
+    <w:name w:val="Pie de página Car"/>
+    <w:basedOn w:val="Fuentedeprrafopredeter"/>
+    <w:link w:val="Piedepgina"/>
     <w:uiPriority w:val="99"/>
     <w:rsid w:val="004C51BE"/>
   </w:style>
-  <w:style w:type="paragraph" w:styleId="NoSpacing">
+  <w:style w:type="paragraph" w:styleId="Sinespaciado">
     <w:name w:val="No Spacing"/>
-    <w:link w:val="NoSpacingChar"/>
+    <w:link w:val="SinespaciadoCar"/>
     <w:uiPriority w:val="1"/>
     <w:qFormat/>
     <w:rsid w:val="005078DA"/>
@@ -4786,10 +4786,10 @@
       <w:lang w:val="es-EC"/>
     </w:rPr>
   </w:style>
-  <w:style w:type="character" w:customStyle="1" w:styleId="NoSpacingChar">
-    <w:name w:val="No Spacing Char"/>
-    <w:basedOn w:val="DefaultParagraphFont"/>
-    <w:link w:val="NoSpacing"/>
+  <w:style w:type="character" w:customStyle="1" w:styleId="SinespaciadoCar">
+    <w:name w:val="Sin espaciado Car"/>
+    <w:basedOn w:val="Fuentedeprrafopredeter"/>
+    <w:link w:val="Sinespaciado"/>
     <w:uiPriority w:val="1"/>
     <w:locked/>
     <w:rsid w:val="005078DA"/>
@@ -4797,9 +4797,9 @@
       <w:lang w:val="es-EC"/>
     </w:rPr>
   </w:style>
-  <w:style w:type="table" w:styleId="TableGrid">
+  <w:style w:type="table" w:styleId="Tablaconcuadrcula">
     <w:name w:val="Table Grid"/>
-    <w:basedOn w:val="TableNormal"/>
+    <w:basedOn w:val="Tablanormal"/>
     <w:uiPriority w:val="59"/>
     <w:rsid w:val="005078DA"/>
     <w:pPr>
@@ -4816,10 +4816,10 @@
       </w:tblBorders>
     </w:tblPr>
   </w:style>
-  <w:style w:type="paragraph" w:styleId="BalloonText">
+  <w:style w:type="paragraph" w:styleId="Textodeglobo">
     <w:name w:val="Balloon Text"/>
     <w:basedOn w:val="Normal"/>
-    <w:link w:val="BalloonTextChar"/>
+    <w:link w:val="TextodegloboCar"/>
     <w:uiPriority w:val="99"/>
     <w:semiHidden/>
     <w:unhideWhenUsed/>
@@ -4830,10 +4830,10 @@
       <w:szCs w:val="18"/>
     </w:rPr>
   </w:style>
-  <w:style w:type="character" w:customStyle="1" w:styleId="BalloonTextChar">
-    <w:name w:val="Balloon Text Char"/>
-    <w:basedOn w:val="DefaultParagraphFont"/>
-    <w:link w:val="BalloonText"/>
+  <w:style w:type="character" w:customStyle="1" w:styleId="TextodegloboCar">
+    <w:name w:val="Texto de globo Car"/>
+    <w:basedOn w:val="Fuentedeprrafopredeter"/>
+    <w:link w:val="Textodeglobo"/>
     <w:uiPriority w:val="99"/>
     <w:semiHidden/>
     <w:rsid w:val="000B45E7"/>
@@ -4856,7 +4856,7 @@
       <w:lang w:val="es-EC" w:eastAsia="es-EC"/>
     </w:rPr>
   </w:style>
-  <w:style w:type="paragraph" w:styleId="ListParagraph">
+  <w:style w:type="paragraph" w:styleId="Prrafodelista">
     <w:name w:val="List Paragraph"/>
     <w:basedOn w:val="Normal"/>
     <w:uiPriority w:val="34"/>
@@ -5166,12 +5166,11 @@
 </file>
 
 <file path=customXml/item1.xml><?xml version="1.0" encoding="utf-8"?>
-<?mso-contentType ?>
-<FormTemplates xmlns="http://schemas.microsoft.com/sharepoint/v3/contenttype/forms">
-  <Display>DocumentLibraryForm</Display>
-  <Edit>DocumentLibraryForm</Edit>
-  <New>DocumentLibraryForm</New>
-</FormTemplates>
+<p:properties xmlns:p="http://schemas.microsoft.com/office/2006/metadata/properties" xmlns:xsi="http://www.w3.org/2001/XMLSchema-instance" xmlns:pc="http://schemas.microsoft.com/office/infopath/2007/PartnerControls">
+  <documentManagement>
+    <_activity xmlns="f1fd4f5f-a887-4536-8473-96cb4bd6ae39" xsi:nil="true"/>
+  </documentManagement>
+</p:properties>
 </file>
 
 <file path=customXml/item2.xml><?xml version="1.0" encoding="utf-8"?>
@@ -5428,17 +5427,20 @@
 </file>
 
 <file path=customXml/item3.xml><?xml version="1.0" encoding="utf-8"?>
-<p:properties xmlns:p="http://schemas.microsoft.com/office/2006/metadata/properties" xmlns:xsi="http://www.w3.org/2001/XMLSchema-instance" xmlns:pc="http://schemas.microsoft.com/office/infopath/2007/PartnerControls">
-  <documentManagement>
-    <_activity xmlns="f1fd4f5f-a887-4536-8473-96cb4bd6ae39" xsi:nil="true"/>
-  </documentManagement>
-</p:properties>
+<?mso-contentType ?>
+<FormTemplates xmlns="http://schemas.microsoft.com/sharepoint/v3/contenttype/forms">
+  <Display>DocumentLibraryForm</Display>
+  <Edit>DocumentLibraryForm</Edit>
+  <New>DocumentLibraryForm</New>
+</FormTemplates>
 </file>
 
 <file path=customXml/itemProps1.xml><?xml version="1.0" encoding="utf-8"?>
-<ds:datastoreItem xmlns:ds="http://schemas.openxmlformats.org/officeDocument/2006/customXml" ds:itemID="{B4A33F56-6D31-42E5-B0B0-758A64845536}">
+<ds:datastoreItem xmlns:ds="http://schemas.openxmlformats.org/officeDocument/2006/customXml" ds:itemID="{A86E6CDC-FA02-429E-B4F3-4499F0351A83}">
   <ds:schemaRefs>
-    <ds:schemaRef ds:uri="http://schemas.microsoft.com/sharepoint/v3/contenttype/forms"/>
+    <ds:schemaRef ds:uri="http://schemas.microsoft.com/office/2006/metadata/properties"/>
+    <ds:schemaRef ds:uri="http://schemas.microsoft.com/office/infopath/2007/PartnerControls"/>
+    <ds:schemaRef ds:uri="f1fd4f5f-a887-4536-8473-96cb4bd6ae39"/>
   </ds:schemaRefs>
 </ds:datastoreItem>
 </file>
@@ -5463,11 +5465,9 @@
 </file>
 
 <file path=customXml/itemProps3.xml><?xml version="1.0" encoding="utf-8"?>
-<ds:datastoreItem xmlns:ds="http://schemas.openxmlformats.org/officeDocument/2006/customXml" ds:itemID="{A86E6CDC-FA02-429E-B4F3-4499F0351A83}">
+<ds:datastoreItem xmlns:ds="http://schemas.openxmlformats.org/officeDocument/2006/customXml" ds:itemID="{B4A33F56-6D31-42E5-B0B0-758A64845536}">
   <ds:schemaRefs>
-    <ds:schemaRef ds:uri="http://schemas.microsoft.com/office/2006/metadata/properties"/>
-    <ds:schemaRef ds:uri="http://schemas.microsoft.com/office/infopath/2007/PartnerControls"/>
-    <ds:schemaRef ds:uri="f1fd4f5f-a887-4536-8473-96cb4bd6ae39"/>
+    <ds:schemaRef ds:uri="http://schemas.microsoft.com/sharepoint/v3/contenttype/forms"/>
   </ds:schemaRefs>
 </ds:datastoreItem>
 </file>
</xml_diff>